<commit_message>
Cập nhật báo cáo + kế hoạch slide: thay SQLite bằng Microsoft Access (đồng bộ với code)
</commit_message>
<xml_diff>
--- a/BaoCaoDoAnCuoiKi_QuanLyNhaHang_HoQuangHuy.docx
+++ b/BaoCaoDoAnCuoiKi_QuanLyNhaHang_HoQuangHuy.docx
@@ -360,7 +360,7 @@
           <w:sz w:val="26"/>
           <w:szCs w:val="26"/>
         </w:rPr>
-        <w:t xml:space="preserve">Đồ án này cũng được xây dựng dựa trên sự kế thừa và tham khảo từ nhiều nguồn tài liệu khoa học, sách chuyên ngành, tài liệu chính thức của Microsoft về .NET và SQLite, cùng các công trình nghiên cứu có liên quan, đóng vai trò quan trọng trong việc mở rộng hiểu biết và nâng cao chất lượng bài làm.</w:t>
+        <w:t xml:space="preserve">Đồ án này cũng được xây dựng dựa trên sự kế thừa và tham khảo từ nhiều nguồn tài liệu khoa học, sách chuyên ngành, tài liệu chính thức của Microsoft về .NET và Microsoft Access, cùng các công trình nghiên cứu có liên quan, đóng vai trò quan trọng trong việc mở rộng hiểu biết và nâng cao chất lượng bài làm.</w:t>
       </w:r>
     </w:p>
     <w:p>
@@ -481,1556 +481,9 @@
         <w:p>
           <w:r>
             <w:fldChar w:fldCharType="begin" w:dirty="true"/>
-          </w:r>
-          <w:r>
-            <w:instrText xml:space="preserve">TOC \h \o "1-3" </w:instrText>
-          </w:r>
-          <w:r>
+            <w:instrText xml:space="preserve">TOC \h \o "1-3" \t "Heading1,1,Heading2,2,Heading3,3"</w:instrText>
             <w:fldChar w:fldCharType="separate"/>
           </w:r>
-        </w:p>
-        <w:p>
-          <w:pPr>
-            <w:pStyle w:val="9"/>
-            <w:tabs>
-              <w:tab w:val="right" w:leader="dot" w:pos="9026"/>
-            </w:tabs>
-            <w:spacing w:before="120" w:after="60"/>
-          </w:pPr>
-          <w:hyperlink w:anchor="_Toc100000" w:history="1">
-            <w:r>
-              <w:rPr>
-                <w:rStyle w:val="Hyperlink"/>
-              </w:rPr>
-              <w:t>CHƯƠNG 1: Lý do chọn đề tài</w:t>
-            </w:r>
-            <w:r>
-              <w:tab/>
-            </w:r>
-            <w:r>
-              <w:fldChar w:fldCharType="begin"/>
-            </w:r>
-            <w:r>
-              <w:instrText xml:space="preserve"> PAGEREF _Toc100000 \h </w:instrText>
-            </w:r>
-            <w:r>
-              <w:fldChar w:fldCharType="separate"/>
-            </w:r>
-            <w:r>
-              <w:t>5</w:t>
-            </w:r>
-            <w:r>
-              <w:fldChar w:fldCharType="end"/>
-            </w:r>
-          </w:hyperlink>
-        </w:p>
-        <w:p>
-          <w:pPr>
-            <w:pStyle w:val="9"/>
-            <w:tabs>
-              <w:tab w:val="right" w:leader="dot" w:pos="9026"/>
-            </w:tabs>
-            <w:spacing w:before="120" w:after="60"/>
-          </w:pPr>
-          <w:hyperlink w:anchor="_Toc100001" w:history="1">
-            <w:r>
-              <w:rPr>
-                <w:rStyle w:val="Hyperlink"/>
-              </w:rPr>
-              <w:t>CHƯƠNG 2: Định hướng và yêu cầu triển khai đề tài</w:t>
-            </w:r>
-            <w:r>
-              <w:tab/>
-            </w:r>
-            <w:r>
-              <w:fldChar w:fldCharType="begin"/>
-            </w:r>
-            <w:r>
-              <w:instrText xml:space="preserve"> PAGEREF _Toc100001 \h </w:instrText>
-            </w:r>
-            <w:r>
-              <w:fldChar w:fldCharType="separate"/>
-            </w:r>
-            <w:r>
-              <w:t>5</w:t>
-            </w:r>
-            <w:r>
-              <w:fldChar w:fldCharType="end"/>
-            </w:r>
-          </w:hyperlink>
-        </w:p>
-        <w:p>
-          <w:pPr>
-            <w:pStyle w:val="11"/>
-            <w:ind w:left="360"/>
-            <w:tabs>
-              <w:tab w:val="right" w:leader="dot" w:pos="9026"/>
-            </w:tabs>
-            <w:spacing w:before="120" w:after="60"/>
-          </w:pPr>
-          <w:hyperlink w:anchor="_Toc100002" w:history="1">
-            <w:r>
-              <w:rPr>
-                <w:rStyle w:val="Hyperlink"/>
-              </w:rPr>
-              <w:t>2.1. Mục tiêu chung của đề tài</w:t>
-            </w:r>
-            <w:r>
-              <w:tab/>
-            </w:r>
-            <w:r>
-              <w:fldChar w:fldCharType="begin"/>
-            </w:r>
-            <w:r>
-              <w:instrText xml:space="preserve"> PAGEREF _Toc100002 \h </w:instrText>
-            </w:r>
-            <w:r>
-              <w:fldChar w:fldCharType="separate"/>
-            </w:r>
-            <w:r>
-              <w:t>6</w:t>
-            </w:r>
-            <w:r>
-              <w:fldChar w:fldCharType="end"/>
-            </w:r>
-          </w:hyperlink>
-        </w:p>
-        <w:p>
-          <w:pPr>
-            <w:pStyle w:val="11"/>
-            <w:ind w:left="360"/>
-            <w:tabs>
-              <w:tab w:val="right" w:leader="dot" w:pos="9026"/>
-            </w:tabs>
-            <w:spacing w:before="120" w:after="60"/>
-          </w:pPr>
-          <w:hyperlink w:anchor="_Toc100003" w:history="1">
-            <w:r>
-              <w:rPr>
-                <w:rStyle w:val="Hyperlink"/>
-              </w:rPr>
-              <w:t>2.2. Các yêu cầu cần đạt được</w:t>
-            </w:r>
-            <w:r>
-              <w:tab/>
-            </w:r>
-            <w:r>
-              <w:fldChar w:fldCharType="begin"/>
-            </w:r>
-            <w:r>
-              <w:instrText xml:space="preserve"> PAGEREF _Toc100003 \h </w:instrText>
-            </w:r>
-            <w:r>
-              <w:fldChar w:fldCharType="separate"/>
-            </w:r>
-            <w:r>
-              <w:t>6</w:t>
-            </w:r>
-            <w:r>
-              <w:fldChar w:fldCharType="end"/>
-            </w:r>
-          </w:hyperlink>
-        </w:p>
-        <w:p>
-          <w:pPr>
-            <w:pStyle w:val="11"/>
-            <w:ind w:left="360"/>
-            <w:tabs>
-              <w:tab w:val="right" w:leader="dot" w:pos="9026"/>
-            </w:tabs>
-            <w:spacing w:before="120" w:after="60"/>
-          </w:pPr>
-          <w:hyperlink w:anchor="_Toc100004" w:history="1">
-            <w:r>
-              <w:rPr>
-                <w:rStyle w:val="Hyperlink"/>
-              </w:rPr>
-              <w:t>2.3. Phạm vi đề tài</w:t>
-            </w:r>
-            <w:r>
-              <w:tab/>
-            </w:r>
-            <w:r>
-              <w:fldChar w:fldCharType="begin"/>
-            </w:r>
-            <w:r>
-              <w:instrText xml:space="preserve"> PAGEREF _Toc100004 \h </w:instrText>
-            </w:r>
-            <w:r>
-              <w:fldChar w:fldCharType="separate"/>
-            </w:r>
-            <w:r>
-              <w:t>7</w:t>
-            </w:r>
-            <w:r>
-              <w:fldChar w:fldCharType="end"/>
-            </w:r>
-          </w:hyperlink>
-        </w:p>
-        <w:p>
-          <w:pPr>
-            <w:pStyle w:val="9"/>
-            <w:tabs>
-              <w:tab w:val="right" w:leader="dot" w:pos="9026"/>
-            </w:tabs>
-            <w:spacing w:before="120" w:after="60"/>
-          </w:pPr>
-          <w:hyperlink w:anchor="_Toc100005" w:history="1">
-            <w:r>
-              <w:rPr>
-                <w:rStyle w:val="Hyperlink"/>
-              </w:rPr>
-              <w:t>CHƯƠNG 3: Lý thuyết nền cho đề tài</w:t>
-            </w:r>
-            <w:r>
-              <w:tab/>
-            </w:r>
-            <w:r>
-              <w:fldChar w:fldCharType="begin"/>
-            </w:r>
-            <w:r>
-              <w:instrText xml:space="preserve"> PAGEREF _Toc100005 \h </w:instrText>
-            </w:r>
-            <w:r>
-              <w:fldChar w:fldCharType="separate"/>
-            </w:r>
-            <w:r>
-              <w:t>8</w:t>
-            </w:r>
-            <w:r>
-              <w:fldChar w:fldCharType="end"/>
-            </w:r>
-          </w:hyperlink>
-        </w:p>
-        <w:p>
-          <w:pPr>
-            <w:pStyle w:val="11"/>
-            <w:ind w:left="360"/>
-            <w:tabs>
-              <w:tab w:val="right" w:leader="dot" w:pos="9026"/>
-            </w:tabs>
-            <w:spacing w:before="120" w:after="60"/>
-          </w:pPr>
-          <w:hyperlink w:anchor="_Toc100006" w:history="1">
-            <w:r>
-              <w:rPr>
-                <w:rStyle w:val="Hyperlink"/>
-              </w:rPr>
-              <w:t>3.1. Khái niệm về tin học quản lý</w:t>
-            </w:r>
-            <w:r>
-              <w:tab/>
-            </w:r>
-            <w:r>
-              <w:fldChar w:fldCharType="begin"/>
-            </w:r>
-            <w:r>
-              <w:instrText xml:space="preserve"> PAGEREF _Toc100006 \h </w:instrText>
-            </w:r>
-            <w:r>
-              <w:fldChar w:fldCharType="separate"/>
-            </w:r>
-            <w:r>
-              <w:t>8</w:t>
-            </w:r>
-            <w:r>
-              <w:fldChar w:fldCharType="end"/>
-            </w:r>
-          </w:hyperlink>
-        </w:p>
-        <w:p>
-          <w:pPr>
-            <w:pStyle w:val="11"/>
-            <w:ind w:left="360"/>
-            <w:tabs>
-              <w:tab w:val="right" w:leader="dot" w:pos="9026"/>
-            </w:tabs>
-            <w:spacing w:before="120" w:after="60"/>
-          </w:pPr>
-          <w:hyperlink w:anchor="_Toc100007" w:history="1">
-            <w:r>
-              <w:rPr>
-                <w:rStyle w:val="Hyperlink"/>
-              </w:rPr>
-              <w:t>3.2. Các nguyên lý của lập trình hướng đối tượng</w:t>
-            </w:r>
-            <w:r>
-              <w:tab/>
-            </w:r>
-            <w:r>
-              <w:fldChar w:fldCharType="begin"/>
-            </w:r>
-            <w:r>
-              <w:instrText xml:space="preserve"> PAGEREF _Toc100007 \h </w:instrText>
-            </w:r>
-            <w:r>
-              <w:fldChar w:fldCharType="separate"/>
-            </w:r>
-            <w:r>
-              <w:t>8</w:t>
-            </w:r>
-            <w:r>
-              <w:fldChar w:fldCharType="end"/>
-            </w:r>
-          </w:hyperlink>
-        </w:p>
-        <w:p>
-          <w:pPr>
-            <w:pStyle w:val="12"/>
-            <w:ind w:left="720"/>
-            <w:tabs>
-              <w:tab w:val="right" w:leader="dot" w:pos="9026"/>
-            </w:tabs>
-            <w:spacing w:before="120" w:after="60"/>
-          </w:pPr>
-          <w:hyperlink w:anchor="_Toc100008" w:history="1">
-            <w:r>
-              <w:rPr>
-                <w:rStyle w:val="Hyperlink"/>
-              </w:rPr>
-              <w:t>3.2.1. Đóng gói (Encapsulation)</w:t>
-            </w:r>
-            <w:r>
-              <w:tab/>
-            </w:r>
-            <w:r>
-              <w:fldChar w:fldCharType="begin"/>
-            </w:r>
-            <w:r>
-              <w:instrText xml:space="preserve"> PAGEREF _Toc100008 \h </w:instrText>
-            </w:r>
-            <w:r>
-              <w:fldChar w:fldCharType="separate"/>
-            </w:r>
-            <w:r>
-              <w:t>8</w:t>
-            </w:r>
-            <w:r>
-              <w:fldChar w:fldCharType="end"/>
-            </w:r>
-          </w:hyperlink>
-        </w:p>
-        <w:p>
-          <w:pPr>
-            <w:pStyle w:val="12"/>
-            <w:ind w:left="720"/>
-            <w:tabs>
-              <w:tab w:val="right" w:leader="dot" w:pos="9026"/>
-            </w:tabs>
-            <w:spacing w:before="120" w:after="60"/>
-          </w:pPr>
-          <w:hyperlink w:anchor="_Toc100009" w:history="1">
-            <w:r>
-              <w:rPr>
-                <w:rStyle w:val="Hyperlink"/>
-              </w:rPr>
-              <w:t>3.2.2. Kế thừa (Inheritance)</w:t>
-            </w:r>
-            <w:r>
-              <w:tab/>
-            </w:r>
-            <w:r>
-              <w:fldChar w:fldCharType="begin"/>
-            </w:r>
-            <w:r>
-              <w:instrText xml:space="preserve"> PAGEREF _Toc100009 \h </w:instrText>
-            </w:r>
-            <w:r>
-              <w:fldChar w:fldCharType="separate"/>
-            </w:r>
-            <w:r>
-              <w:t>9</w:t>
-            </w:r>
-            <w:r>
-              <w:fldChar w:fldCharType="end"/>
-            </w:r>
-          </w:hyperlink>
-        </w:p>
-        <w:p>
-          <w:pPr>
-            <w:pStyle w:val="12"/>
-            <w:ind w:left="720"/>
-            <w:tabs>
-              <w:tab w:val="right" w:leader="dot" w:pos="9026"/>
-            </w:tabs>
-            <w:spacing w:before="120" w:after="60"/>
-          </w:pPr>
-          <w:hyperlink w:anchor="_Toc100010" w:history="1">
-            <w:r>
-              <w:rPr>
-                <w:rStyle w:val="Hyperlink"/>
-              </w:rPr>
-              <w:t>3.2.3. Đa hình (Polymorphism)</w:t>
-            </w:r>
-            <w:r>
-              <w:tab/>
-            </w:r>
-            <w:r>
-              <w:fldChar w:fldCharType="begin"/>
-            </w:r>
-            <w:r>
-              <w:instrText xml:space="preserve"> PAGEREF _Toc100010 \h </w:instrText>
-            </w:r>
-            <w:r>
-              <w:fldChar w:fldCharType="separate"/>
-            </w:r>
-            <w:r>
-              <w:t>9</w:t>
-            </w:r>
-            <w:r>
-              <w:fldChar w:fldCharType="end"/>
-            </w:r>
-          </w:hyperlink>
-        </w:p>
-        <w:p>
-          <w:pPr>
-            <w:pStyle w:val="12"/>
-            <w:ind w:left="720"/>
-            <w:tabs>
-              <w:tab w:val="right" w:leader="dot" w:pos="9026"/>
-            </w:tabs>
-            <w:spacing w:before="120" w:after="60"/>
-          </w:pPr>
-          <w:hyperlink w:anchor="_Toc100011" w:history="1">
-            <w:r>
-              <w:rPr>
-                <w:rStyle w:val="Hyperlink"/>
-              </w:rPr>
-              <w:t>3.2.4. Trừu tượng (Abstraction)</w:t>
-            </w:r>
-            <w:r>
-              <w:tab/>
-            </w:r>
-            <w:r>
-              <w:fldChar w:fldCharType="begin"/>
-            </w:r>
-            <w:r>
-              <w:instrText xml:space="preserve"> PAGEREF _Toc100011 \h </w:instrText>
-            </w:r>
-            <w:r>
-              <w:fldChar w:fldCharType="separate"/>
-            </w:r>
-            <w:r>
-              <w:t>10</w:t>
-            </w:r>
-            <w:r>
-              <w:fldChar w:fldCharType="end"/>
-            </w:r>
-          </w:hyperlink>
-        </w:p>
-        <w:p>
-          <w:pPr>
-            <w:pStyle w:val="11"/>
-            <w:ind w:left="360"/>
-            <w:tabs>
-              <w:tab w:val="right" w:leader="dot" w:pos="9026"/>
-            </w:tabs>
-            <w:spacing w:before="120" w:after="60"/>
-          </w:pPr>
-          <w:hyperlink w:anchor="_Toc100012" w:history="1">
-            <w:r>
-              <w:rPr>
-                <w:rStyle w:val="Hyperlink"/>
-              </w:rPr>
-              <w:t>3.3. Hệ quản trị cơ sở dữ liệu SQLite</w:t>
-            </w:r>
-            <w:r>
-              <w:tab/>
-            </w:r>
-            <w:r>
-              <w:fldChar w:fldCharType="begin"/>
-            </w:r>
-            <w:r>
-              <w:instrText xml:space="preserve"> PAGEREF _Toc100012 \h </w:instrText>
-            </w:r>
-            <w:r>
-              <w:fldChar w:fldCharType="separate"/>
-            </w:r>
-            <w:r>
-              <w:t>10</w:t>
-            </w:r>
-            <w:r>
-              <w:fldChar w:fldCharType="end"/>
-            </w:r>
-          </w:hyperlink>
-        </w:p>
-        <w:p>
-          <w:pPr>
-            <w:pStyle w:val="11"/>
-            <w:ind w:left="360"/>
-            <w:tabs>
-              <w:tab w:val="right" w:leader="dot" w:pos="9026"/>
-            </w:tabs>
-            <w:spacing w:before="120" w:after="60"/>
-          </w:pPr>
-          <w:hyperlink w:anchor="_Toc100013" w:history="1">
-            <w:r>
-              <w:rPr>
-                <w:rStyle w:val="Hyperlink"/>
-              </w:rPr>
-              <w:t>3.4. Môi trường phát triển Visual Studio và .NET 10</w:t>
-            </w:r>
-            <w:r>
-              <w:tab/>
-            </w:r>
-            <w:r>
-              <w:fldChar w:fldCharType="begin"/>
-            </w:r>
-            <w:r>
-              <w:instrText xml:space="preserve"> PAGEREF _Toc100013 \h </w:instrText>
-            </w:r>
-            <w:r>
-              <w:fldChar w:fldCharType="separate"/>
-            </w:r>
-            <w:r>
-              <w:t>12</w:t>
-            </w:r>
-            <w:r>
-              <w:fldChar w:fldCharType="end"/>
-            </w:r>
-          </w:hyperlink>
-        </w:p>
-        <w:p>
-          <w:pPr>
-            <w:pStyle w:val="11"/>
-            <w:ind w:left="360"/>
-            <w:tabs>
-              <w:tab w:val="right" w:leader="dot" w:pos="9026"/>
-            </w:tabs>
-            <w:spacing w:before="120" w:after="60"/>
-          </w:pPr>
-          <w:hyperlink w:anchor="_Toc100014" w:history="1">
-            <w:r>
-              <w:rPr>
-                <w:rStyle w:val="Hyperlink"/>
-              </w:rPr>
-              <w:t>3.5. Thư viện Microsoft Edge WebView2</w:t>
-            </w:r>
-            <w:r>
-              <w:tab/>
-            </w:r>
-            <w:r>
-              <w:fldChar w:fldCharType="begin"/>
-            </w:r>
-            <w:r>
-              <w:instrText xml:space="preserve"> PAGEREF _Toc100014 \h </w:instrText>
-            </w:r>
-            <w:r>
-              <w:fldChar w:fldCharType="separate"/>
-            </w:r>
-            <w:r>
-              <w:t>13</w:t>
-            </w:r>
-            <w:r>
-              <w:fldChar w:fldCharType="end"/>
-            </w:r>
-          </w:hyperlink>
-        </w:p>
-        <w:p>
-          <w:pPr>
-            <w:pStyle w:val="11"/>
-            <w:ind w:left="360"/>
-            <w:tabs>
-              <w:tab w:val="right" w:leader="dot" w:pos="9026"/>
-            </w:tabs>
-            <w:spacing w:before="120" w:after="60"/>
-          </w:pPr>
-          <w:hyperlink w:anchor="_Toc100015" w:history="1">
-            <w:r>
-              <w:rPr>
-                <w:rStyle w:val="Hyperlink"/>
-              </w:rPr>
-              <w:t>3.6. Framework CSS Tailwind CSS</w:t>
-            </w:r>
-            <w:r>
-              <w:tab/>
-            </w:r>
-            <w:r>
-              <w:fldChar w:fldCharType="begin"/>
-            </w:r>
-            <w:r>
-              <w:instrText xml:space="preserve"> PAGEREF _Toc100015 \h </w:instrText>
-            </w:r>
-            <w:r>
-              <w:fldChar w:fldCharType="separate"/>
-            </w:r>
-            <w:r>
-              <w:t>14</w:t>
-            </w:r>
-            <w:r>
-              <w:fldChar w:fldCharType="end"/>
-            </w:r>
-          </w:hyperlink>
-        </w:p>
-        <w:p>
-          <w:pPr>
-            <w:pStyle w:val="9"/>
-            <w:tabs>
-              <w:tab w:val="right" w:leader="dot" w:pos="9026"/>
-            </w:tabs>
-            <w:spacing w:before="120" w:after="60"/>
-          </w:pPr>
-          <w:hyperlink w:anchor="_Toc100016" w:history="1">
-            <w:r>
-              <w:rPr>
-                <w:rStyle w:val="Hyperlink"/>
-              </w:rPr>
-              <w:t>CHƯƠNG 4: Phân tích, thiết kế và xây dựng hệ thống quản lý nhà hàng</w:t>
-            </w:r>
-            <w:r>
-              <w:tab/>
-            </w:r>
-            <w:r>
-              <w:fldChar w:fldCharType="begin"/>
-            </w:r>
-            <w:r>
-              <w:instrText xml:space="preserve"> PAGEREF _Toc100016 \h </w:instrText>
-            </w:r>
-            <w:r>
-              <w:fldChar w:fldCharType="separate"/>
-            </w:r>
-            <w:r>
-              <w:t>15</w:t>
-            </w:r>
-            <w:r>
-              <w:fldChar w:fldCharType="end"/>
-            </w:r>
-          </w:hyperlink>
-        </w:p>
-        <w:p>
-          <w:pPr>
-            <w:pStyle w:val="11"/>
-            <w:ind w:left="360"/>
-            <w:tabs>
-              <w:tab w:val="right" w:leader="dot" w:pos="9026"/>
-            </w:tabs>
-            <w:spacing w:before="120" w:after="60"/>
-          </w:pPr>
-          <w:hyperlink w:anchor="_Toc100017" w:history="1">
-            <w:r>
-              <w:rPr>
-                <w:rStyle w:val="Hyperlink"/>
-              </w:rPr>
-              <w:t>4.1. Thực trạng quản lý nhà hàng hiện nay</w:t>
-            </w:r>
-            <w:r>
-              <w:tab/>
-            </w:r>
-            <w:r>
-              <w:fldChar w:fldCharType="begin"/>
-            </w:r>
-            <w:r>
-              <w:instrText xml:space="preserve"> PAGEREF _Toc100017 \h </w:instrText>
-            </w:r>
-            <w:r>
-              <w:fldChar w:fldCharType="separate"/>
-            </w:r>
-            <w:r>
-              <w:t>15</w:t>
-            </w:r>
-            <w:r>
-              <w:fldChar w:fldCharType="end"/>
-            </w:r>
-          </w:hyperlink>
-        </w:p>
-        <w:p>
-          <w:pPr>
-            <w:pStyle w:val="11"/>
-            <w:ind w:left="360"/>
-            <w:tabs>
-              <w:tab w:val="right" w:leader="dot" w:pos="9026"/>
-            </w:tabs>
-            <w:spacing w:before="120" w:after="60"/>
-          </w:pPr>
-          <w:hyperlink w:anchor="_Toc100018" w:history="1">
-            <w:r>
-              <w:rPr>
-                <w:rStyle w:val="Hyperlink"/>
-              </w:rPr>
-              <w:t>4.2. Ưu điểm và khuyết điểm của hệ thống quản lý nhà hàng tự động</w:t>
-            </w:r>
-            <w:r>
-              <w:tab/>
-            </w:r>
-            <w:r>
-              <w:fldChar w:fldCharType="begin"/>
-            </w:r>
-            <w:r>
-              <w:instrText xml:space="preserve"> PAGEREF _Toc100018 \h </w:instrText>
-            </w:r>
-            <w:r>
-              <w:fldChar w:fldCharType="separate"/>
-            </w:r>
-            <w:r>
-              <w:t>16</w:t>
-            </w:r>
-            <w:r>
-              <w:fldChar w:fldCharType="end"/>
-            </w:r>
-          </w:hyperlink>
-        </w:p>
-        <w:p>
-          <w:pPr>
-            <w:pStyle w:val="11"/>
-            <w:ind w:left="360"/>
-            <w:tabs>
-              <w:tab w:val="right" w:leader="dot" w:pos="9026"/>
-            </w:tabs>
-            <w:spacing w:before="120" w:after="60"/>
-          </w:pPr>
-          <w:hyperlink w:anchor="_Toc100019" w:history="1">
-            <w:r>
-              <w:rPr>
-                <w:rStyle w:val="Hyperlink"/>
-              </w:rPr>
-              <w:t>4.3. Tính năng</w:t>
-            </w:r>
-            <w:r>
-              <w:tab/>
-            </w:r>
-            <w:r>
-              <w:fldChar w:fldCharType="begin"/>
-            </w:r>
-            <w:r>
-              <w:instrText xml:space="preserve"> PAGEREF _Toc100019 \h </w:instrText>
-            </w:r>
-            <w:r>
-              <w:fldChar w:fldCharType="separate"/>
-            </w:r>
-            <w:r>
-              <w:t>18</w:t>
-            </w:r>
-            <w:r>
-              <w:fldChar w:fldCharType="end"/>
-            </w:r>
-          </w:hyperlink>
-        </w:p>
-        <w:p>
-          <w:pPr>
-            <w:pStyle w:val="11"/>
-            <w:ind w:left="360"/>
-            <w:tabs>
-              <w:tab w:val="right" w:leader="dot" w:pos="9026"/>
-            </w:tabs>
-            <w:spacing w:before="120" w:after="60"/>
-          </w:pPr>
-          <w:hyperlink w:anchor="_Toc100020" w:history="1">
-            <w:r>
-              <w:rPr>
-                <w:rStyle w:val="Hyperlink"/>
-              </w:rPr>
-              <w:t>4.4. Xây dựng hệ thống ban đầu</w:t>
-            </w:r>
-            <w:r>
-              <w:tab/>
-            </w:r>
-            <w:r>
-              <w:fldChar w:fldCharType="begin"/>
-            </w:r>
-            <w:r>
-              <w:instrText xml:space="preserve"> PAGEREF _Toc100020 \h </w:instrText>
-            </w:r>
-            <w:r>
-              <w:fldChar w:fldCharType="separate"/>
-            </w:r>
-            <w:r>
-              <w:t>23</w:t>
-            </w:r>
-            <w:r>
-              <w:fldChar w:fldCharType="end"/>
-            </w:r>
-          </w:hyperlink>
-        </w:p>
-        <w:p>
-          <w:pPr>
-            <w:pStyle w:val="12"/>
-            <w:ind w:left="720"/>
-            <w:tabs>
-              <w:tab w:val="right" w:leader="dot" w:pos="9026"/>
-            </w:tabs>
-            <w:spacing w:before="120" w:after="60"/>
-          </w:pPr>
-          <w:hyperlink w:anchor="_Toc100021" w:history="1">
-            <w:r>
-              <w:rPr>
-                <w:rStyle w:val="Hyperlink"/>
-              </w:rPr>
-              <w:t>4.4.1. Bảng Ban</w:t>
-            </w:r>
-            <w:r>
-              <w:tab/>
-            </w:r>
-            <w:r>
-              <w:fldChar w:fldCharType="begin"/>
-            </w:r>
-            <w:r>
-              <w:instrText xml:space="preserve"> PAGEREF _Toc100021 \h </w:instrText>
-            </w:r>
-            <w:r>
-              <w:fldChar w:fldCharType="separate"/>
-            </w:r>
-            <w:r>
-              <w:t>23</w:t>
-            </w:r>
-            <w:r>
-              <w:fldChar w:fldCharType="end"/>
-            </w:r>
-          </w:hyperlink>
-        </w:p>
-        <w:p>
-          <w:pPr>
-            <w:pStyle w:val="12"/>
-            <w:ind w:left="720"/>
-            <w:tabs>
-              <w:tab w:val="right" w:leader="dot" w:pos="9026"/>
-            </w:tabs>
-            <w:spacing w:before="120" w:after="60"/>
-          </w:pPr>
-          <w:hyperlink w:anchor="_Toc100022" w:history="1">
-            <w:r>
-              <w:rPr>
-                <w:rStyle w:val="Hyperlink"/>
-              </w:rPr>
-              <w:t>4.4.2. Bảng SanPham</w:t>
-            </w:r>
-            <w:r>
-              <w:tab/>
-            </w:r>
-            <w:r>
-              <w:fldChar w:fldCharType="begin"/>
-            </w:r>
-            <w:r>
-              <w:instrText xml:space="preserve"> PAGEREF _Toc100022 \h </w:instrText>
-            </w:r>
-            <w:r>
-              <w:fldChar w:fldCharType="separate"/>
-            </w:r>
-            <w:r>
-              <w:t>23</w:t>
-            </w:r>
-            <w:r>
-              <w:fldChar w:fldCharType="end"/>
-            </w:r>
-          </w:hyperlink>
-        </w:p>
-        <w:p>
-          <w:pPr>
-            <w:pStyle w:val="12"/>
-            <w:ind w:left="720"/>
-            <w:tabs>
-              <w:tab w:val="right" w:leader="dot" w:pos="9026"/>
-            </w:tabs>
-            <w:spacing w:before="120" w:after="60"/>
-          </w:pPr>
-          <w:hyperlink w:anchor="_Toc100023" w:history="1">
-            <w:r>
-              <w:rPr>
-                <w:rStyle w:val="Hyperlink"/>
-              </w:rPr>
-              <w:t>4.4.3. Bảng HoaDon</w:t>
-            </w:r>
-            <w:r>
-              <w:tab/>
-            </w:r>
-            <w:r>
-              <w:fldChar w:fldCharType="begin"/>
-            </w:r>
-            <w:r>
-              <w:instrText xml:space="preserve"> PAGEREF _Toc100023 \h </w:instrText>
-            </w:r>
-            <w:r>
-              <w:fldChar w:fldCharType="separate"/>
-            </w:r>
-            <w:r>
-              <w:t>24</w:t>
-            </w:r>
-            <w:r>
-              <w:fldChar w:fldCharType="end"/>
-            </w:r>
-          </w:hyperlink>
-        </w:p>
-        <w:p>
-          <w:pPr>
-            <w:pStyle w:val="12"/>
-            <w:ind w:left="720"/>
-            <w:tabs>
-              <w:tab w:val="right" w:leader="dot" w:pos="9026"/>
-            </w:tabs>
-            <w:spacing w:before="120" w:after="60"/>
-          </w:pPr>
-          <w:hyperlink w:anchor="_Toc100024" w:history="1">
-            <w:r>
-              <w:rPr>
-                <w:rStyle w:val="Hyperlink"/>
-              </w:rPr>
-              <w:t>4.4.4. Bảng ChiTietHoaDon</w:t>
-            </w:r>
-            <w:r>
-              <w:tab/>
-            </w:r>
-            <w:r>
-              <w:fldChar w:fldCharType="begin"/>
-            </w:r>
-            <w:r>
-              <w:instrText xml:space="preserve"> PAGEREF _Toc100024 \h </w:instrText>
-            </w:r>
-            <w:r>
-              <w:fldChar w:fldCharType="separate"/>
-            </w:r>
-            <w:r>
-              <w:t>24</w:t>
-            </w:r>
-            <w:r>
-              <w:fldChar w:fldCharType="end"/>
-            </w:r>
-          </w:hyperlink>
-        </w:p>
-        <w:p>
-          <w:pPr>
-            <w:pStyle w:val="12"/>
-            <w:ind w:left="720"/>
-            <w:tabs>
-              <w:tab w:val="right" w:leader="dot" w:pos="9026"/>
-            </w:tabs>
-            <w:spacing w:before="120" w:after="60"/>
-          </w:pPr>
-          <w:hyperlink w:anchor="_Toc100025" w:history="1">
-            <w:r>
-              <w:rPr>
-                <w:rStyle w:val="Hyperlink"/>
-              </w:rPr>
-              <w:t>4.4.5. Bảng NguoiDung</w:t>
-            </w:r>
-            <w:r>
-              <w:tab/>
-            </w:r>
-            <w:r>
-              <w:fldChar w:fldCharType="begin"/>
-            </w:r>
-            <w:r>
-              <w:instrText xml:space="preserve"> PAGEREF _Toc100025 \h </w:instrText>
-            </w:r>
-            <w:r>
-              <w:fldChar w:fldCharType="separate"/>
-            </w:r>
-            <w:r>
-              <w:t>25</w:t>
-            </w:r>
-            <w:r>
-              <w:fldChar w:fldCharType="end"/>
-            </w:r>
-          </w:hyperlink>
-        </w:p>
-        <w:p>
-          <w:pPr>
-            <w:pStyle w:val="11"/>
-            <w:ind w:left="360"/>
-            <w:tabs>
-              <w:tab w:val="right" w:leader="dot" w:pos="9026"/>
-            </w:tabs>
-            <w:spacing w:before="120" w:after="60"/>
-          </w:pPr>
-          <w:hyperlink w:anchor="_Toc100026" w:history="1">
-            <w:r>
-              <w:rPr>
-                <w:rStyle w:val="Hyperlink"/>
-              </w:rPr>
-              <w:t>4.5. Relationship (Sơ đồ quan hệ thực thể)</w:t>
-            </w:r>
-            <w:r>
-              <w:tab/>
-            </w:r>
-            <w:r>
-              <w:fldChar w:fldCharType="begin"/>
-            </w:r>
-            <w:r>
-              <w:instrText xml:space="preserve"> PAGEREF _Toc100026 \h </w:instrText>
-            </w:r>
-            <w:r>
-              <w:fldChar w:fldCharType="separate"/>
-            </w:r>
-            <w:r>
-              <w:t>25</w:t>
-            </w:r>
-            <w:r>
-              <w:fldChar w:fldCharType="end"/>
-            </w:r>
-          </w:hyperlink>
-        </w:p>
-        <w:p>
-          <w:pPr>
-            <w:pStyle w:val="11"/>
-            <w:ind w:left="360"/>
-            <w:tabs>
-              <w:tab w:val="right" w:leader="dot" w:pos="9026"/>
-            </w:tabs>
-            <w:spacing w:before="120" w:after="60"/>
-          </w:pPr>
-          <w:hyperlink w:anchor="_Toc100027" w:history="1">
-            <w:r>
-              <w:rPr>
-                <w:rStyle w:val="Hyperlink"/>
-              </w:rPr>
-              <w:t>4.6. Nhập dữ liệu cho các bảng</w:t>
-            </w:r>
-            <w:r>
-              <w:tab/>
-            </w:r>
-            <w:r>
-              <w:fldChar w:fldCharType="begin"/>
-            </w:r>
-            <w:r>
-              <w:instrText xml:space="preserve"> PAGEREF _Toc100027 \h </w:instrText>
-            </w:r>
-            <w:r>
-              <w:fldChar w:fldCharType="separate"/>
-            </w:r>
-            <w:r>
-              <w:t>26</w:t>
-            </w:r>
-            <w:r>
-              <w:fldChar w:fldCharType="end"/>
-            </w:r>
-          </w:hyperlink>
-        </w:p>
-        <w:p>
-          <w:pPr>
-            <w:pStyle w:val="12"/>
-            <w:ind w:left="720"/>
-            <w:tabs>
-              <w:tab w:val="right" w:leader="dot" w:pos="9026"/>
-            </w:tabs>
-            <w:spacing w:before="120" w:after="60"/>
-          </w:pPr>
-          <w:hyperlink w:anchor="_Toc100028" w:history="1">
-            <w:r>
-              <w:rPr>
-                <w:rStyle w:val="Hyperlink"/>
-              </w:rPr>
-              <w:t>4.6.1. Bảng Ban</w:t>
-            </w:r>
-            <w:r>
-              <w:tab/>
-            </w:r>
-            <w:r>
-              <w:fldChar w:fldCharType="begin"/>
-            </w:r>
-            <w:r>
-              <w:instrText xml:space="preserve"> PAGEREF _Toc100028 \h </w:instrText>
-            </w:r>
-            <w:r>
-              <w:fldChar w:fldCharType="separate"/>
-            </w:r>
-            <w:r>
-              <w:t>26</w:t>
-            </w:r>
-            <w:r>
-              <w:fldChar w:fldCharType="end"/>
-            </w:r>
-          </w:hyperlink>
-        </w:p>
-        <w:p>
-          <w:pPr>
-            <w:pStyle w:val="12"/>
-            <w:ind w:left="720"/>
-            <w:tabs>
-              <w:tab w:val="right" w:leader="dot" w:pos="9026"/>
-            </w:tabs>
-            <w:spacing w:before="120" w:after="60"/>
-          </w:pPr>
-          <w:hyperlink w:anchor="_Toc100029" w:history="1">
-            <w:r>
-              <w:rPr>
-                <w:rStyle w:val="Hyperlink"/>
-              </w:rPr>
-              <w:t>4.6.2. Bảng SanPham</w:t>
-            </w:r>
-            <w:r>
-              <w:tab/>
-            </w:r>
-            <w:r>
-              <w:fldChar w:fldCharType="begin"/>
-            </w:r>
-            <w:r>
-              <w:instrText xml:space="preserve"> PAGEREF _Toc100029 \h </w:instrText>
-            </w:r>
-            <w:r>
-              <w:fldChar w:fldCharType="separate"/>
-            </w:r>
-            <w:r>
-              <w:t>27</w:t>
-            </w:r>
-            <w:r>
-              <w:fldChar w:fldCharType="end"/>
-            </w:r>
-          </w:hyperlink>
-        </w:p>
-        <w:p>
-          <w:pPr>
-            <w:pStyle w:val="12"/>
-            <w:ind w:left="720"/>
-            <w:tabs>
-              <w:tab w:val="right" w:leader="dot" w:pos="9026"/>
-            </w:tabs>
-            <w:spacing w:before="120" w:after="60"/>
-          </w:pPr>
-          <w:hyperlink w:anchor="_Toc100030" w:history="1">
-            <w:r>
-              <w:rPr>
-                <w:rStyle w:val="Hyperlink"/>
-              </w:rPr>
-              <w:t>4.6.3. Bảng HoaDon</w:t>
-            </w:r>
-            <w:r>
-              <w:tab/>
-            </w:r>
-            <w:r>
-              <w:fldChar w:fldCharType="begin"/>
-            </w:r>
-            <w:r>
-              <w:instrText xml:space="preserve"> PAGEREF _Toc100030 \h </w:instrText>
-            </w:r>
-            <w:r>
-              <w:fldChar w:fldCharType="separate"/>
-            </w:r>
-            <w:r>
-              <w:t>27</w:t>
-            </w:r>
-            <w:r>
-              <w:fldChar w:fldCharType="end"/>
-            </w:r>
-          </w:hyperlink>
-        </w:p>
-        <w:p>
-          <w:pPr>
-            <w:pStyle w:val="12"/>
-            <w:ind w:left="720"/>
-            <w:tabs>
-              <w:tab w:val="right" w:leader="dot" w:pos="9026"/>
-            </w:tabs>
-            <w:spacing w:before="120" w:after="60"/>
-          </w:pPr>
-          <w:hyperlink w:anchor="_Toc100031" w:history="1">
-            <w:r>
-              <w:rPr>
-                <w:rStyle w:val="Hyperlink"/>
-              </w:rPr>
-              <w:t>4.6.4. Bảng ChiTietHoaDon</w:t>
-            </w:r>
-            <w:r>
-              <w:tab/>
-            </w:r>
-            <w:r>
-              <w:fldChar w:fldCharType="begin"/>
-            </w:r>
-            <w:r>
-              <w:instrText xml:space="preserve"> PAGEREF _Toc100031 \h </w:instrText>
-            </w:r>
-            <w:r>
-              <w:fldChar w:fldCharType="separate"/>
-            </w:r>
-            <w:r>
-              <w:t>28</w:t>
-            </w:r>
-            <w:r>
-              <w:fldChar w:fldCharType="end"/>
-            </w:r>
-          </w:hyperlink>
-        </w:p>
-        <w:p>
-          <w:pPr>
-            <w:pStyle w:val="12"/>
-            <w:ind w:left="720"/>
-            <w:tabs>
-              <w:tab w:val="right" w:leader="dot" w:pos="9026"/>
-            </w:tabs>
-            <w:spacing w:before="120" w:after="60"/>
-          </w:pPr>
-          <w:hyperlink w:anchor="_Toc100032" w:history="1">
-            <w:r>
-              <w:rPr>
-                <w:rStyle w:val="Hyperlink"/>
-              </w:rPr>
-              <w:t>4.6.5. Bảng NguoiDung</w:t>
-            </w:r>
-            <w:r>
-              <w:tab/>
-            </w:r>
-            <w:r>
-              <w:fldChar w:fldCharType="begin"/>
-            </w:r>
-            <w:r>
-              <w:instrText xml:space="preserve"> PAGEREF _Toc100032 \h </w:instrText>
-            </w:r>
-            <w:r>
-              <w:fldChar w:fldCharType="separate"/>
-            </w:r>
-            <w:r>
-              <w:t>28</w:t>
-            </w:r>
-            <w:r>
-              <w:fldChar w:fldCharType="end"/>
-            </w:r>
-          </w:hyperlink>
-        </w:p>
-        <w:p>
-          <w:pPr>
-            <w:pStyle w:val="11"/>
-            <w:ind w:left="360"/>
-            <w:tabs>
-              <w:tab w:val="right" w:leader="dot" w:pos="9026"/>
-            </w:tabs>
-            <w:spacing w:before="120" w:after="60"/>
-          </w:pPr>
-          <w:hyperlink w:anchor="_Toc100033" w:history="1">
-            <w:r>
-              <w:rPr>
-                <w:rStyle w:val="Hyperlink"/>
-              </w:rPr>
-              <w:t>4.7. Giao diện</w:t>
-            </w:r>
-            <w:r>
-              <w:tab/>
-            </w:r>
-            <w:r>
-              <w:fldChar w:fldCharType="begin"/>
-            </w:r>
-            <w:r>
-              <w:instrText xml:space="preserve"> PAGEREF _Toc100033 \h </w:instrText>
-            </w:r>
-            <w:r>
-              <w:fldChar w:fldCharType="separate"/>
-            </w:r>
-            <w:r>
-              <w:t>29</w:t>
-            </w:r>
-            <w:r>
-              <w:fldChar w:fldCharType="end"/>
-            </w:r>
-          </w:hyperlink>
-        </w:p>
-        <w:p>
-          <w:pPr>
-            <w:pStyle w:val="12"/>
-            <w:ind w:left="720"/>
-            <w:tabs>
-              <w:tab w:val="right" w:leader="dot" w:pos="9026"/>
-            </w:tabs>
-            <w:spacing w:before="120" w:after="60"/>
-          </w:pPr>
-          <w:hyperlink w:anchor="_Toc100034" w:history="1">
-            <w:r>
-              <w:rPr>
-                <w:rStyle w:val="Hyperlink"/>
-              </w:rPr>
-              <w:t>4.7.1. Giao diện đăng nhập</w:t>
-            </w:r>
-            <w:r>
-              <w:tab/>
-            </w:r>
-            <w:r>
-              <w:fldChar w:fldCharType="begin"/>
-            </w:r>
-            <w:r>
-              <w:instrText xml:space="preserve"> PAGEREF _Toc100034 \h </w:instrText>
-            </w:r>
-            <w:r>
-              <w:fldChar w:fldCharType="separate"/>
-            </w:r>
-            <w:r>
-              <w:t>29</w:t>
-            </w:r>
-            <w:r>
-              <w:fldChar w:fldCharType="end"/>
-            </w:r>
-          </w:hyperlink>
-        </w:p>
-        <w:p>
-          <w:pPr>
-            <w:pStyle w:val="12"/>
-            <w:ind w:left="720"/>
-            <w:tabs>
-              <w:tab w:val="right" w:leader="dot" w:pos="9026"/>
-            </w:tabs>
-            <w:spacing w:before="120" w:after="60"/>
-          </w:pPr>
-          <w:hyperlink w:anchor="_Toc100035" w:history="1">
-            <w:r>
-              <w:rPr>
-                <w:rStyle w:val="Hyperlink"/>
-              </w:rPr>
-              <w:t>4.7.2. Giao diện Sơ đồ bàn</w:t>
-            </w:r>
-            <w:r>
-              <w:tab/>
-            </w:r>
-            <w:r>
-              <w:fldChar w:fldCharType="begin"/>
-            </w:r>
-            <w:r>
-              <w:instrText xml:space="preserve"> PAGEREF _Toc100035 \h </w:instrText>
-            </w:r>
-            <w:r>
-              <w:fldChar w:fldCharType="separate"/>
-            </w:r>
-            <w:r>
-              <w:t>29</w:t>
-            </w:r>
-            <w:r>
-              <w:fldChar w:fldCharType="end"/>
-            </w:r>
-          </w:hyperlink>
-        </w:p>
-        <w:p>
-          <w:pPr>
-            <w:pStyle w:val="12"/>
-            <w:ind w:left="720"/>
-            <w:tabs>
-              <w:tab w:val="right" w:leader="dot" w:pos="9026"/>
-            </w:tabs>
-            <w:spacing w:before="120" w:after="60"/>
-          </w:pPr>
-          <w:hyperlink w:anchor="_Toc100036" w:history="1">
-            <w:r>
-              <w:rPr>
-                <w:rStyle w:val="Hyperlink"/>
-              </w:rPr>
-              <w:t>4.7.3. Giao diện Gọi món</w:t>
-            </w:r>
-            <w:r>
-              <w:tab/>
-            </w:r>
-            <w:r>
-              <w:fldChar w:fldCharType="begin"/>
-            </w:r>
-            <w:r>
-              <w:instrText xml:space="preserve"> PAGEREF _Toc100036 \h </w:instrText>
-            </w:r>
-            <w:r>
-              <w:fldChar w:fldCharType="separate"/>
-            </w:r>
-            <w:r>
-              <w:t>30</w:t>
-            </w:r>
-            <w:r>
-              <w:fldChar w:fldCharType="end"/>
-            </w:r>
-          </w:hyperlink>
-        </w:p>
-        <w:p>
-          <w:pPr>
-            <w:pStyle w:val="12"/>
-            <w:ind w:left="720"/>
-            <w:tabs>
-              <w:tab w:val="right" w:leader="dot" w:pos="9026"/>
-            </w:tabs>
-            <w:spacing w:before="120" w:after="60"/>
-          </w:pPr>
-          <w:hyperlink w:anchor="_Toc100037" w:history="1">
-            <w:r>
-              <w:rPr>
-                <w:rStyle w:val="Hyperlink"/>
-              </w:rPr>
-              <w:t>4.7.4. Giao diện Thực đơn</w:t>
-            </w:r>
-            <w:r>
-              <w:tab/>
-            </w:r>
-            <w:r>
-              <w:fldChar w:fldCharType="begin"/>
-            </w:r>
-            <w:r>
-              <w:instrText xml:space="preserve"> PAGEREF _Toc100037 \h </w:instrText>
-            </w:r>
-            <w:r>
-              <w:fldChar w:fldCharType="separate"/>
-            </w:r>
-            <w:r>
-              <w:t>30</w:t>
-            </w:r>
-            <w:r>
-              <w:fldChar w:fldCharType="end"/>
-            </w:r>
-          </w:hyperlink>
-        </w:p>
-        <w:p>
-          <w:pPr>
-            <w:pStyle w:val="12"/>
-            <w:ind w:left="720"/>
-            <w:tabs>
-              <w:tab w:val="right" w:leader="dot" w:pos="9026"/>
-            </w:tabs>
-            <w:spacing w:before="120" w:after="60"/>
-          </w:pPr>
-          <w:hyperlink w:anchor="_Toc100038" w:history="1">
-            <w:r>
-              <w:rPr>
-                <w:rStyle w:val="Hyperlink"/>
-              </w:rPr>
-              <w:t>4.7.5. Giao diện Lịch sử</w:t>
-            </w:r>
-            <w:r>
-              <w:tab/>
-            </w:r>
-            <w:r>
-              <w:fldChar w:fldCharType="begin"/>
-            </w:r>
-            <w:r>
-              <w:instrText xml:space="preserve"> PAGEREF _Toc100038 \h </w:instrText>
-            </w:r>
-            <w:r>
-              <w:fldChar w:fldCharType="separate"/>
-            </w:r>
-            <w:r>
-              <w:t>31</w:t>
-            </w:r>
-            <w:r>
-              <w:fldChar w:fldCharType="end"/>
-            </w:r>
-          </w:hyperlink>
-        </w:p>
-        <w:p>
-          <w:pPr>
-            <w:pStyle w:val="12"/>
-            <w:ind w:left="720"/>
-            <w:tabs>
-              <w:tab w:val="right" w:leader="dot" w:pos="9026"/>
-            </w:tabs>
-            <w:spacing w:before="120" w:after="60"/>
-          </w:pPr>
-          <w:hyperlink w:anchor="_Toc100039" w:history="1">
-            <w:r>
-              <w:rPr>
-                <w:rStyle w:val="Hyperlink"/>
-              </w:rPr>
-              <w:t>4.7.6. Giao diện Báo cáo</w:t>
-            </w:r>
-            <w:r>
-              <w:tab/>
-            </w:r>
-            <w:r>
-              <w:fldChar w:fldCharType="begin"/>
-            </w:r>
-            <w:r>
-              <w:instrText xml:space="preserve"> PAGEREF _Toc100039 \h </w:instrText>
-            </w:r>
-            <w:r>
-              <w:fldChar w:fldCharType="separate"/>
-            </w:r>
-            <w:r>
-              <w:t>31</w:t>
-            </w:r>
-            <w:r>
-              <w:fldChar w:fldCharType="end"/>
-            </w:r>
-          </w:hyperlink>
-        </w:p>
-        <w:p>
-          <w:pPr>
-            <w:pStyle w:val="9"/>
-            <w:tabs>
-              <w:tab w:val="right" w:leader="dot" w:pos="9026"/>
-            </w:tabs>
-            <w:spacing w:before="120" w:after="60"/>
-          </w:pPr>
-          <w:hyperlink w:anchor="_Toc100040" w:history="1">
-            <w:r>
-              <w:rPr>
-                <w:rStyle w:val="Hyperlink"/>
-              </w:rPr>
-              <w:t>CHƯƠNG 5: Đánh giá và định hướng phát triển</w:t>
-            </w:r>
-            <w:r>
-              <w:tab/>
-            </w:r>
-            <w:r>
-              <w:fldChar w:fldCharType="begin"/>
-            </w:r>
-            <w:r>
-              <w:instrText xml:space="preserve"> PAGEREF _Toc100040 \h </w:instrText>
-            </w:r>
-            <w:r>
-              <w:fldChar w:fldCharType="separate"/>
-            </w:r>
-            <w:r>
-              <w:t>32</w:t>
-            </w:r>
-            <w:r>
-              <w:fldChar w:fldCharType="end"/>
-            </w:r>
-          </w:hyperlink>
-        </w:p>
-        <w:p>
-          <w:pPr>
-            <w:pStyle w:val="11"/>
-            <w:ind w:left="360"/>
-            <w:tabs>
-              <w:tab w:val="right" w:leader="dot" w:pos="9026"/>
-            </w:tabs>
-            <w:spacing w:before="120" w:after="60"/>
-          </w:pPr>
-          <w:hyperlink w:anchor="_Toc100041" w:history="1">
-            <w:r>
-              <w:rPr>
-                <w:rStyle w:val="Hyperlink"/>
-              </w:rPr>
-              <w:t>5.1. Đánh giá</w:t>
-            </w:r>
-            <w:r>
-              <w:tab/>
-            </w:r>
-            <w:r>
-              <w:fldChar w:fldCharType="begin"/>
-            </w:r>
-            <w:r>
-              <w:instrText xml:space="preserve"> PAGEREF _Toc100041 \h </w:instrText>
-            </w:r>
-            <w:r>
-              <w:fldChar w:fldCharType="separate"/>
-            </w:r>
-            <w:r>
-              <w:t>32</w:t>
-            </w:r>
-            <w:r>
-              <w:fldChar w:fldCharType="end"/>
-            </w:r>
-          </w:hyperlink>
-        </w:p>
-        <w:p>
-          <w:pPr>
-            <w:pStyle w:val="11"/>
-            <w:ind w:left="360"/>
-            <w:tabs>
-              <w:tab w:val="right" w:leader="dot" w:pos="9026"/>
-            </w:tabs>
-            <w:spacing w:before="120" w:after="60"/>
-          </w:pPr>
-          <w:hyperlink w:anchor="_Toc100042" w:history="1">
-            <w:r>
-              <w:rPr>
-                <w:rStyle w:val="Hyperlink"/>
-              </w:rPr>
-              <w:t>5.2. Định hướng phát triển</w:t>
-            </w:r>
-            <w:r>
-              <w:tab/>
-            </w:r>
-            <w:r>
-              <w:fldChar w:fldCharType="begin"/>
-            </w:r>
-            <w:r>
-              <w:instrText xml:space="preserve"> PAGEREF _Toc100042 \h </w:instrText>
-            </w:r>
-            <w:r>
-              <w:fldChar w:fldCharType="separate"/>
-            </w:r>
-            <w:r>
-              <w:t>32</w:t>
-            </w:r>
-            <w:r>
-              <w:fldChar w:fldCharType="end"/>
-            </w:r>
-          </w:hyperlink>
         </w:p>
         <w:p>
           <w:r>
@@ -2321,7 +774,7 @@
                 <w:sz w:val="24"/>
                 <w:szCs w:val="24"/>
               </w:rPr>
-              <w:t xml:space="preserve">Phân tích yêu cầu và thiết kế cơ sở dữ liệu SQLite (5 bảng: Ban, SanPham, HoaDon, ChiTietHoaDon, NguoiDung)</w:t>
+              <w:t xml:space="preserve">Phân tích yêu cầu và thiết kế cơ sở dữ liệu Microsoft Access (5 bảng: Ban, SanPham, HoaDon, ChiTietHoaDon, NguoiDung)</w:t>
             </w:r>
           </w:p>
         </w:tc>
@@ -2884,7 +1337,6 @@
         <w:spacing w:after="160" w:before="360" w:line="360"/>
         <w:jc w:val="left"/>
       </w:pPr>
-      <w:bookmarkStart w:id="100000" w:name="_Toc100000"/>
       <w:r>
         <w:rPr>
           <w:rFonts w:ascii="Times New Roman" w:eastAsia="Times New Roman"/>
@@ -2896,7 +1348,6 @@
         </w:rPr>
         <w:t xml:space="preserve">CHƯƠNG 1: Lý do chọn đề tài</w:t>
       </w:r>
-      <w:bookmarkEnd w:id="100000"/>
     </w:p>
     <w:p>
       <w:pPr>
@@ -2964,7 +1415,6 @@
         <w:spacing w:after="160" w:before="360" w:line="360"/>
         <w:jc w:val="left"/>
       </w:pPr>
-      <w:bookmarkStart w:id="100001" w:name="_Toc100001"/>
       <w:r>
         <w:rPr>
           <w:rFonts w:ascii="Times New Roman" w:eastAsia="Times New Roman"/>
@@ -2976,7 +1426,6 @@
         </w:rPr>
         <w:t xml:space="preserve">CHƯƠNG 2: Định hướng và yêu cầu triển khai đề tài</w:t>
       </w:r>
-      <w:bookmarkEnd w:id="100001"/>
     </w:p>
     <w:p>
       <w:pPr>
@@ -2984,7 +1433,6 @@
         <w:spacing w:after="120" w:before="280" w:line="360"/>
         <w:jc w:val="left"/>
       </w:pPr>
-      <w:bookmarkStart w:id="100002" w:name="_Toc100002"/>
       <w:r>
         <w:rPr>
           <w:rFonts w:ascii="Times New Roman" w:eastAsia="Times New Roman"/>
@@ -2996,7 +1444,6 @@
         </w:rPr>
         <w:t xml:space="preserve">2.1. Mục tiêu chung của đề tài</w:t>
       </w:r>
-      <w:bookmarkEnd w:id="100002"/>
     </w:p>
     <w:p>
       <w:pPr>
@@ -3044,7 +1491,6 @@
         <w:spacing w:after="120" w:before="280" w:line="360"/>
         <w:jc w:val="left"/>
       </w:pPr>
-      <w:bookmarkStart w:id="100003" w:name="_Toc100003"/>
       <w:r>
         <w:rPr>
           <w:rFonts w:ascii="Times New Roman" w:eastAsia="Times New Roman"/>
@@ -3056,7 +1502,6 @@
         </w:rPr>
         <w:t xml:space="preserve">2.2. Các yêu cầu cần đạt được</w:t>
       </w:r>
-      <w:bookmarkEnd w:id="100003"/>
     </w:p>
     <w:p>
       <w:pPr>
@@ -3204,7 +1649,6 @@
         <w:spacing w:after="120" w:before="280" w:line="360"/>
         <w:jc w:val="left"/>
       </w:pPr>
-      <w:bookmarkStart w:id="100004" w:name="_Toc100004"/>
       <w:r>
         <w:rPr>
           <w:rFonts w:ascii="Times New Roman" w:eastAsia="Times New Roman"/>
@@ -3216,7 +1660,6 @@
         </w:rPr>
         <w:t xml:space="preserve">2.3. Phạm vi đề tài</w:t>
       </w:r>
-      <w:bookmarkEnd w:id="100004"/>
     </w:p>
     <w:p>
       <w:pPr>
@@ -3286,7 +1729,6 @@
         <w:spacing w:after="160" w:before="360" w:line="360"/>
         <w:jc w:val="left"/>
       </w:pPr>
-      <w:bookmarkStart w:id="100005" w:name="_Toc100005"/>
       <w:r>
         <w:rPr>
           <w:rFonts w:ascii="Times New Roman" w:eastAsia="Times New Roman"/>
@@ -3298,7 +1740,6 @@
         </w:rPr>
         <w:t xml:space="preserve">CHƯƠNG 3: Lý thuyết nền cho đề tài</w:t>
       </w:r>
-      <w:bookmarkEnd w:id="100005"/>
     </w:p>
     <w:p>
       <w:pPr>
@@ -3306,7 +1747,6 @@
         <w:spacing w:after="120" w:before="280" w:line="360"/>
         <w:jc w:val="left"/>
       </w:pPr>
-      <w:bookmarkStart w:id="100006" w:name="_Toc100006"/>
       <w:r>
         <w:rPr>
           <w:rFonts w:ascii="Times New Roman" w:eastAsia="Times New Roman"/>
@@ -3318,7 +1758,6 @@
         </w:rPr>
         <w:t xml:space="preserve">3.1. Khái niệm về tin học quản lý</w:t>
       </w:r>
-      <w:bookmarkEnd w:id="100006"/>
     </w:p>
     <w:p>
       <w:pPr>
@@ -3386,7 +1825,6 @@
         <w:spacing w:after="120" w:before="280" w:line="360"/>
         <w:jc w:val="left"/>
       </w:pPr>
-      <w:bookmarkStart w:id="100007" w:name="_Toc100007"/>
       <w:r>
         <w:rPr>
           <w:rFonts w:ascii="Times New Roman" w:eastAsia="Times New Roman"/>
@@ -3398,7 +1836,6 @@
         </w:rPr>
         <w:t xml:space="preserve">3.2. Các nguyên lý của lập trình hướng đối tượng</w:t>
       </w:r>
-      <w:bookmarkEnd w:id="100007"/>
     </w:p>
     <w:p>
       <w:pPr>
@@ -3426,7 +1863,6 @@
         <w:spacing w:after="100" w:before="220" w:line="360"/>
         <w:jc w:val="left"/>
       </w:pPr>
-      <w:bookmarkStart w:id="100008" w:name="_Toc100008"/>
       <w:r>
         <w:rPr>
           <w:rFonts w:ascii="Times New Roman" w:eastAsia="Times New Roman"/>
@@ -3438,7 +1874,6 @@
         </w:rPr>
         <w:t xml:space="preserve">3.2.1. Đóng gói (Encapsulation)</w:t>
       </w:r>
-      <w:bookmarkEnd w:id="100008"/>
     </w:p>
     <w:p>
       <w:pPr>
@@ -3486,7 +1921,6 @@
         <w:spacing w:after="100" w:before="220" w:line="360"/>
         <w:jc w:val="left"/>
       </w:pPr>
-      <w:bookmarkStart w:id="100009" w:name="_Toc100009"/>
       <w:r>
         <w:rPr>
           <w:rFonts w:ascii="Times New Roman" w:eastAsia="Times New Roman"/>
@@ -3498,7 +1932,6 @@
         </w:rPr>
         <w:t xml:space="preserve">3.2.2. Kế thừa (Inheritance)</w:t>
       </w:r>
-      <w:bookmarkEnd w:id="100009"/>
     </w:p>
     <w:p>
       <w:pPr>
@@ -3546,7 +1979,6 @@
         <w:spacing w:after="100" w:before="220" w:line="360"/>
         <w:jc w:val="left"/>
       </w:pPr>
-      <w:bookmarkStart w:id="100010" w:name="_Toc100010"/>
       <w:r>
         <w:rPr>
           <w:rFonts w:ascii="Times New Roman" w:eastAsia="Times New Roman"/>
@@ -3558,7 +1990,6 @@
         </w:rPr>
         <w:t xml:space="preserve">3.2.3. Đa hình (Polymorphism)</w:t>
       </w:r>
-      <w:bookmarkEnd w:id="100010"/>
     </w:p>
     <w:p>
       <w:pPr>
@@ -3606,7 +2037,6 @@
         <w:spacing w:after="100" w:before="220" w:line="360"/>
         <w:jc w:val="left"/>
       </w:pPr>
-      <w:bookmarkStart w:id="100011" w:name="_Toc100011"/>
       <w:r>
         <w:rPr>
           <w:rFonts w:ascii="Times New Roman" w:eastAsia="Times New Roman"/>
@@ -3618,7 +2048,6 @@
         </w:rPr>
         <w:t xml:space="preserve">3.2.4. Trừu tượng (Abstraction)</w:t>
       </w:r>
-      <w:bookmarkEnd w:id="100011"/>
     </w:p>
     <w:p>
       <w:pPr>
@@ -3666,7 +2095,6 @@
         <w:spacing w:after="120" w:before="280" w:line="360"/>
         <w:jc w:val="left"/>
       </w:pPr>
-      <w:bookmarkStart w:id="100012" w:name="_Toc100012"/>
       <w:r>
         <w:rPr>
           <w:rFonts w:ascii="Times New Roman" w:eastAsia="Times New Roman"/>
@@ -3676,9 +2104,8 @@
           <w:sz w:val="28"/>
           <w:szCs w:val="28"/>
         </w:rPr>
-        <w:t xml:space="preserve">3.3. Hệ quản trị cơ sở dữ liệu SQLite</w:t>
-      </w:r>
-      <w:bookmarkEnd w:id="100012"/>
+        <w:t xml:space="preserve">3.3. Hệ quản trị cơ sở dữ liệu Microsoft Access</w:t>
+      </w:r>
     </w:p>
     <w:p>
       <w:pPr>
@@ -3697,7 +2124,7 @@
           <w:sz w:val="26"/>
           <w:szCs w:val="26"/>
         </w:rPr>
-        <w:t xml:space="preserve">SQLite là một hệ quản trị cơ sở dữ liệu (HQTCSDL) quan hệ nhẹ, không cần máy chủ (serverless), được tích hợp trực tiếp vào ứng dụng dưới dạng một thư viện. Dữ liệu được lưu trong một tệp tin đơn (.db), không cần cài đặt dịch vụ riêng, rất phù hợp cho các ứng dụng desktop quy mô vừa và nhỏ.</w:t>
+        <w:t xml:space="preserve">Microsoft Access là một hệ quản trị cơ sở dữ liệu (HQTCSDL) quan hệ thuộc bộ Microsoft Office, lưu dữ liệu trong một tệp tin đơn (.accdb), không cần cài đặt dịch vụ máy chủ riêng. Access kết hợp vừa là HQTCSDL vừa là công cụ quản lý trực quan (forms, reports, queries), rất phù hợp cho các ứng dụng desktop quy mô vừa và nhỏ.</w:t>
       </w:r>
     </w:p>
     <w:p>
@@ -3717,87 +2144,87 @@
           <w:sz w:val="26"/>
           <w:szCs w:val="26"/>
         </w:rPr>
-        <w:t xml:space="preserve">Các chức năng chính của SQLite bao gồm:</w:t>
-      </w:r>
-    </w:p>
-    <w:p>
-      <w:pPr>
-        <w:pStyle w:val="ListParagraph"/>
-        <w:numPr>
-          <w:ilvl w:val="0"/>
-          <w:numId w:val="1"/>
-        </w:numPr>
-        <w:spacing w:after="60" w:before="0" w:line="360"/>
-        <w:jc w:val="both"/>
-      </w:pPr>
-      <w:r>
-        <w:rPr>
-          <w:rFonts w:ascii="Times New Roman" w:eastAsia="Times New Roman"/>
-          <w:color w:val="000000"/>
-          <w:sz w:val="26"/>
-          <w:szCs w:val="26"/>
-        </w:rPr>
-        <w:t xml:space="preserve">Quản lý dữ liệu: Cho phép tạo lập, lưu trữ, cập nhật và khai thác dữ liệu một cách có hệ thống, đảm bảo tính nhất quán và dễ dàng truy xuất thông qua ngôn ngữ SQL tiêu chuẩn.</w:t>
-      </w:r>
-    </w:p>
-    <w:p>
-      <w:pPr>
-        <w:pStyle w:val="ListParagraph"/>
-        <w:numPr>
-          <w:ilvl w:val="0"/>
-          <w:numId w:val="1"/>
-        </w:numPr>
-        <w:spacing w:after="60" w:before="0" w:line="360"/>
-        <w:jc w:val="both"/>
-      </w:pPr>
-      <w:r>
-        <w:rPr>
-          <w:rFonts w:ascii="Times New Roman" w:eastAsia="Times New Roman"/>
-          <w:color w:val="000000"/>
-          <w:sz w:val="26"/>
-          <w:szCs w:val="26"/>
-        </w:rPr>
-        <w:t xml:space="preserve">Quản lý quan hệ: Hỗ trợ quản lý dữ liệu và các mối quan hệ phức tạp giữa các bảng, đảm bảo tính toàn vẹn thông tin thông qua các ràng buộc khóa chính (PRIMARY KEY), khóa ngoại (FOREIGN KEY) và câu lệnh PRAGMA foreign_keys = ON.</w:t>
-      </w:r>
-    </w:p>
-    <w:p>
-      <w:pPr>
-        <w:pStyle w:val="ListParagraph"/>
-        <w:numPr>
-          <w:ilvl w:val="0"/>
-          <w:numId w:val="1"/>
-        </w:numPr>
-        <w:spacing w:after="60" w:before="0" w:line="360"/>
-        <w:jc w:val="both"/>
-      </w:pPr>
-      <w:r>
-        <w:rPr>
-          <w:rFonts w:ascii="Times New Roman" w:eastAsia="Times New Roman"/>
-          <w:color w:val="000000"/>
-          <w:sz w:val="26"/>
-          <w:szCs w:val="26"/>
-        </w:rPr>
-        <w:t xml:space="preserve">Tối ưu hóa truy vấn: Hỗ trợ chỉ mục (index), transaction (BEGIN/COMMIT/ROLLBACK) và chuẩn bị sẵn câu lệnh (prepared statement) để đơn giản hóa việc nhập liệu, thay đổi dữ liệu, đồng thời tối ưu hiệu suất và chống SQL Injection.</w:t>
-      </w:r>
-    </w:p>
-    <w:p>
-      <w:pPr>
-        <w:pStyle w:val="ListParagraph"/>
-        <w:numPr>
-          <w:ilvl w:val="0"/>
-          <w:numId w:val="1"/>
-        </w:numPr>
-        <w:spacing w:after="60" w:before="0" w:line="360"/>
-        <w:jc w:val="both"/>
-      </w:pPr>
-      <w:r>
-        <w:rPr>
-          <w:rFonts w:ascii="Times New Roman" w:eastAsia="Times New Roman"/>
-          <w:color w:val="000000"/>
-          <w:sz w:val="26"/>
-          <w:szCs w:val="26"/>
-        </w:rPr>
-        <w:t xml:space="preserve">Giao diện quản lý: Có thể dùng các công cụ trực quan miễn phí như DB Browser for SQLite hoặc extension SQLite cho Visual Studio Code để xem và chỉnh sửa dữ liệu một cách dễ dàng.</w:t>
+        <w:t xml:space="preserve">Các chức năng chính của Microsoft Access bao gồm:</w:t>
+      </w:r>
+    </w:p>
+    <w:p>
+      <w:pPr>
+        <w:pStyle w:val="ListParagraph"/>
+        <w:numPr>
+          <w:ilvl w:val="0"/>
+          <w:numId w:val="1"/>
+        </w:numPr>
+        <w:spacing w:after="60" w:before="0" w:line="360"/>
+        <w:jc w:val="both"/>
+      </w:pPr>
+      <w:r>
+        <w:rPr>
+          <w:rFonts w:ascii="Times New Roman" w:eastAsia="Times New Roman"/>
+          <w:color w:val="000000"/>
+          <w:sz w:val="26"/>
+          <w:szCs w:val="26"/>
+        </w:rPr>
+        <w:t xml:space="preserve">Quản lý dữ liệu: Cho phép tạo lập, lưu trữ, cập nhật và khai thác dữ liệu một cách có hệ thống, đảm bảo tính nhất quán và dễ dàng truy xuất thông qua ngôn ngữ SQL (dialect Jet SQL/ACE SQL) và giao diện trực quan.</w:t>
+      </w:r>
+    </w:p>
+    <w:p>
+      <w:pPr>
+        <w:pStyle w:val="ListParagraph"/>
+        <w:numPr>
+          <w:ilvl w:val="0"/>
+          <w:numId w:val="1"/>
+        </w:numPr>
+        <w:spacing w:after="60" w:before="0" w:line="360"/>
+        <w:jc w:val="both"/>
+      </w:pPr>
+      <w:r>
+        <w:rPr>
+          <w:rFonts w:ascii="Times New Roman" w:eastAsia="Times New Roman"/>
+          <w:color w:val="000000"/>
+          <w:sz w:val="26"/>
+          <w:szCs w:val="26"/>
+        </w:rPr>
+        <w:t xml:space="preserve">Quản lý quan hệ: Hỗ trợ quản lý dữ liệu và các mối quan hệ phức tạp giữa các bảng, đảm bảo tính toàn vẹn thông tin thông qua các ràng buộc khóa chính (PRIMARY KEY), khóa ngoại (FOREIGN KEY) với tùy chọn Cascade Update / Cascade Delete, và tự động ép buộc toàn vẹn tham chiếu (Referential Integrity).</w:t>
+      </w:r>
+    </w:p>
+    <w:p>
+      <w:pPr>
+        <w:pStyle w:val="ListParagraph"/>
+        <w:numPr>
+          <w:ilvl w:val="0"/>
+          <w:numId w:val="1"/>
+        </w:numPr>
+        <w:spacing w:after="60" w:before="0" w:line="360"/>
+        <w:jc w:val="both"/>
+      </w:pPr>
+      <w:r>
+        <w:rPr>
+          <w:rFonts w:ascii="Times New Roman" w:eastAsia="Times New Roman"/>
+          <w:color w:val="000000"/>
+          <w:sz w:val="26"/>
+          <w:szCs w:val="26"/>
+        </w:rPr>
+        <w:t xml:space="preserve">Tối ưu hóa truy vấn: Hỗ trợ chỉ mục (index), transaction thông qua OLE DB provider, và chuẩn bị sẵn câu lệnh (parameterized query) để đơn giản hóa việc nhập liệu, thay đổi dữ liệu, đồng thời tối ưu hiệu suất và chống SQL Injection.</w:t>
+      </w:r>
+    </w:p>
+    <w:p>
+      <w:pPr>
+        <w:pStyle w:val="ListParagraph"/>
+        <w:numPr>
+          <w:ilvl w:val="0"/>
+          <w:numId w:val="1"/>
+        </w:numPr>
+        <w:spacing w:after="60" w:before="0" w:line="360"/>
+        <w:jc w:val="both"/>
+      </w:pPr>
+      <w:r>
+        <w:rPr>
+          <w:rFonts w:ascii="Times New Roman" w:eastAsia="Times New Roman"/>
+          <w:color w:val="000000"/>
+          <w:sz w:val="26"/>
+          <w:szCs w:val="26"/>
+        </w:rPr>
+        <w:t xml:space="preserve">Giao diện quản lý: Có thể dùng chính ứng dụng Microsoft Access để mở file .accdb, xem và chỉnh sửa dữ liệu qua Datasheet View, thiết kế bảng qua Design View, hoặc dùng LibreOffice Base trên hệ điều hành không có MS Access.</w:t>
       </w:r>
     </w:p>
     <w:p>
@@ -3817,7 +2244,7 @@
           <w:sz w:val="26"/>
           <w:szCs w:val="26"/>
         </w:rPr>
-        <w:t xml:space="preserve">Các thành phần cơ bản của SQLite bao gồm:</w:t>
+        <w:t xml:space="preserve">Các thành phần cơ bản của Microsoft Access bao gồm:</w:t>
       </w:r>
     </w:p>
     <w:p>
@@ -3857,47 +2284,47 @@
           <w:sz w:val="26"/>
           <w:szCs w:val="26"/>
         </w:rPr>
-        <w:t xml:space="preserve">Column constraint (ràng buộc cột): Bao gồm PRIMARY KEY AUTOINCREMENT, NOT NULL, UNIQUE, CHECK, DEFAULT, FOREIGN KEY. Ví dụ cột GiaCoBan có ràng buộc CHECK(GiaCoBan &gt;= 0) để không cho nhập giá âm.</w:t>
-      </w:r>
-    </w:p>
-    <w:p>
-      <w:pPr>
-        <w:pStyle w:val="ListParagraph"/>
-        <w:numPr>
-          <w:ilvl w:val="0"/>
-          <w:numId w:val="1"/>
-        </w:numPr>
-        <w:spacing w:after="60" w:before="0" w:line="360"/>
-        <w:jc w:val="both"/>
-      </w:pPr>
-      <w:r>
-        <w:rPr>
-          <w:rFonts w:ascii="Times New Roman" w:eastAsia="Times New Roman"/>
-          <w:color w:val="000000"/>
-          <w:sz w:val="26"/>
-          <w:szCs w:val="26"/>
-        </w:rPr>
-        <w:t xml:space="preserve">Prepared statement (câu lệnh chuẩn bị sẵn): Sử dụng SqliteCommand với tham số @TenBan, @GiaCoBan... thay vì nối chuỗi SQL trực tiếp. Đây là cơ chế chính chống SQL Injection trong đồ án.</w:t>
-      </w:r>
-    </w:p>
-    <w:p>
-      <w:pPr>
-        <w:pStyle w:val="ListParagraph"/>
-        <w:numPr>
-          <w:ilvl w:val="0"/>
-          <w:numId w:val="1"/>
-        </w:numPr>
-        <w:spacing w:after="60" w:before="0" w:line="360"/>
-        <w:jc w:val="both"/>
-      </w:pPr>
-      <w:r>
-        <w:rPr>
-          <w:rFonts w:ascii="Times New Roman" w:eastAsia="Times New Roman"/>
-          <w:color w:val="000000"/>
-          <w:sz w:val="26"/>
-          <w:szCs w:val="26"/>
-        </w:rPr>
-        <w:t xml:space="preserve">PRAGMA: Lệnh cấu hình đặc thù của SQLite, ví dụ PRAGMA foreign_keys = ON để bật ràng buộc khóa ngoại (mặc định SQLite tắt).</w:t>
+        <w:t xml:space="preserve">Column constraint (ràng buộc cột): Bao gồm PRIMARY KEY AUTOINCREMENT, NOT NULL, UNIQUE, DEFAULT, FOREIGN KEY. Ví dụ cột GiaCoBan có kiểu Currency (số tiền) tự động không cho nhập giá âm; cột DangBan có kiểu Yes/No (boolean).</w:t>
+      </w:r>
+    </w:p>
+    <w:p>
+      <w:pPr>
+        <w:pStyle w:val="ListParagraph"/>
+        <w:numPr>
+          <w:ilvl w:val="0"/>
+          <w:numId w:val="1"/>
+        </w:numPr>
+        <w:spacing w:after="60" w:before="0" w:line="360"/>
+        <w:jc w:val="both"/>
+      </w:pPr>
+      <w:r>
+        <w:rPr>
+          <w:rFonts w:ascii="Times New Roman" w:eastAsia="Times New Roman"/>
+          <w:color w:val="000000"/>
+          <w:sz w:val="26"/>
+          <w:szCs w:val="26"/>
+        </w:rPr>
+        <w:t xml:space="preserve">Parameterized query (câu lệnh tham số hóa): Sử dụng OleDbCommand với tham số positional (?) hoặc có tên @TenBan, @GiaCoBan... thay vì nối chuỗi SQL trực tiếp. Đây là cơ chế chính chống SQL Injection trong đồ án.</w:t>
+      </w:r>
+    </w:p>
+    <w:p>
+      <w:pPr>
+        <w:pStyle w:val="ListParagraph"/>
+        <w:numPr>
+          <w:ilvl w:val="0"/>
+          <w:numId w:val="1"/>
+        </w:numPr>
+        <w:spacing w:after="60" w:before="0" w:line="360"/>
+        <w:jc w:val="both"/>
+      </w:pPr>
+      <w:r>
+        <w:rPr>
+          <w:rFonts w:ascii="Times New Roman" w:eastAsia="Times New Roman"/>
+          <w:color w:val="000000"/>
+          <w:sz w:val="26"/>
+          <w:szCs w:val="26"/>
+        </w:rPr>
+        <w:t xml:space="preserve">Referential Integrity (toàn vẹn tham chiếu): Access tự động ép buộc ràng buộc khóa ngoại ngay từ khi thiết kế quan hệ (Relationships), không cần bật bằng lệnh PRAGMA như SQLite. Có tùy chọn Cascade Update và Cascade Delete.</w:t>
       </w:r>
     </w:p>
     <w:p>
@@ -3917,7 +2344,7 @@
           <w:sz w:val="26"/>
           <w:szCs w:val="26"/>
         </w:rPr>
-        <w:t xml:space="preserve">Việc lựa chọn SQLite làm hệ quản trị cơ sở dữ liệu cho hệ thống quản lý nhà hàng không chỉ là một quyết định kỹ thuật phù hợp với quy mô đề tài mà còn là một sự đảm bảo về tính toàn vẹn dữ liệu, khả năng triển khai nhanh và hiệu suất xử lý giao dịch. Trong bối cảnh nhà hàng quy mô vừa và nhỏ, độ chính xác của dữ liệu (thông tin bàn, món ăn, hóa đơn) là rất quan trọng. Một cơ sở dữ liệu quan hệ như SQLite hỗ trợ tính toàn vẹn dữ liệu thông qua cấu trúc bảng, khóa chính/khóa ngoại và các ràng buộc CHECK. Lợi ích lớn nhất là tệp cơ sở dữ liệu (nha_hang.db) có thể sao chép, sao lưu dễ dàng, không cần cài đặt dịch vụ phụ trợ, phù hợp cho mô hình máy tính độc lập.</w:t>
+        <w:t xml:space="preserve">Việc lựa chọn Microsoft Access làm hệ quản trị cơ sở dữ liệu cho hệ thống quản lý nhà hàng không chỉ là một quyết định kỹ thuật phù hợp với quy mô đề tài mà còn là một sự đảm bảo về tính toàn vẹn dữ liệu, khả năng triển khai nhanh và hiệu suất xử lý giao dịch. Trong bối cảnh nhà hàng quy mô vừa và nhỏ, độ chính xác của dữ liệu (thông tin bàn, món ăn, hóa đơn) là rất quan trọng. Một cơ sở dữ liệu quan hệ như Access hỗ trợ tính toàn vẹn dữ liệu thông qua cấu trúc bảng, khóa chính/khóa ngoại và các ràng buộc. Lợi ích lớn nhất là tệp cơ sở dữ liệu (QuanLyNhaHang.accdb) có thể sao chép, sao lưu dễ dàng, không cần cài đặt dịch vụ phụ trợ, phù hợp cho mô hình máy tính độc lập.</w:t>
       </w:r>
     </w:p>
     <w:p>
@@ -3926,7 +2353,6 @@
         <w:spacing w:after="120" w:before="280" w:line="360"/>
         <w:jc w:val="left"/>
       </w:pPr>
-      <w:bookmarkStart w:id="100013" w:name="_Toc100013"/>
       <w:r>
         <w:rPr>
           <w:rFonts w:ascii="Times New Roman" w:eastAsia="Times New Roman"/>
@@ -3938,7 +2364,6 @@
         </w:rPr>
         <w:t xml:space="preserve">3.4. Môi trường phát triển Visual Studio và .NET 10</w:t>
       </w:r>
-      <w:bookmarkEnd w:id="100013"/>
     </w:p>
     <w:p>
       <w:pPr>
@@ -3957,7 +2382,7 @@
           <w:sz w:val="26"/>
           <w:szCs w:val="26"/>
         </w:rPr>
-        <w:t xml:space="preserve">Visual Studio (kết hợp .NET 10 SDK) là một môi trường phát triển tích hợp (IDE) mạnh mẽ do Microsoft phát triển. Nó cung cấp một bộ công cụ toàn diện hỗ trợ lập trình viên trong mọi giai đoạn của quá trình phát triển phần mềm, từ thiết kế, viết mã, kiểm thử đến triển khai ứng dụng. Đồ án sử dụng .NET 10 với TargetFramework là net10.0-windows, kết hợp thư viện Microsoft.Web.WebView2 và Microsoft.Data.Sqlite.</w:t>
+        <w:t xml:space="preserve">Visual Studio (kết hợp .NET 10 SDK) là một môi trường phát triển tích hợp (IDE) mạnh mẽ do Microsoft phát triển. Nó cung cấp một bộ công cụ toàn diện hỗ trợ lập trình viên trong mọi giai đoạn của quá trình phát triển phần mềm, từ thiết kế, viết mã, kiểm thử đến triển khai ứng dụng. Đồ án sử dụng .NET 10 với TargetFramework là net10.0-windows, kết hợp thư viện Microsoft.Web.WebView2 và System.Data.OleDb.</w:t>
       </w:r>
     </w:p>
     <w:p>
@@ -4017,7 +2442,7 @@
           <w:sz w:val="26"/>
           <w:szCs w:val="26"/>
         </w:rPr>
-        <w:t xml:space="preserve">Quản lý gói NuGet: Tích hợp NuGet Package Manager cho phép cài đặt nhanh các thư viện cần thiết. Đồ án cài đặt hai gói: Microsoft.Data.Sqlite (để làm việc với SQLite) và Microsoft.Web.WebView2 (để nhúng trình duyệt Edge vào ứng dụng desktop).</w:t>
+        <w:t xml:space="preserve">Quản lý gói NuGet: Tích hợp NuGet Package Manager cho phép cài đặt nhanh các thư viện cần thiết. Đồ án cài đặt hai gói: System.Data.OleDb (để làm việc với Microsoft Access qua provider Microsoft.ACE.OLEDB.12.0) và Microsoft.Web.WebView2 (để nhúng trình duyệt Edge vào ứng dụng desktop).</w:t>
       </w:r>
     </w:p>
     <w:p>
@@ -4126,7 +2551,6 @@
         <w:spacing w:after="120" w:before="280" w:line="360"/>
         <w:jc w:val="left"/>
       </w:pPr>
-      <w:bookmarkStart w:id="100014" w:name="_Toc100014"/>
       <w:r>
         <w:rPr>
           <w:rFonts w:ascii="Times New Roman" w:eastAsia="Times New Roman"/>
@@ -4138,7 +2562,6 @@
         </w:rPr>
         <w:t xml:space="preserve">3.5. Thư viện Microsoft Edge WebView2</w:t>
       </w:r>
-      <w:bookmarkEnd w:id="100014"/>
     </w:p>
     <w:p>
       <w:pPr>
@@ -4277,7 +2700,7 @@
           <w:sz w:val="26"/>
           <w:szCs w:val="26"/>
         </w:rPr>
-        <w:t xml:space="preserve">Đồng bộ dữ liệu qua API: Mọi thao tác của người dùng trên giao diện (thêm bàn, gọi món, thanh toán…) đều được gửi về C# qua fetch(), đảm bảo dữ liệu được lưu vào SQLite ngay lập tức.</w:t>
+        <w:t xml:space="preserve">Đồng bộ dữ liệu qua API: Mọi thao tác của người dùng trên giao diện (thêm bàn, gọi món, thanh toán…) đều được gửi về C# qua fetch(), đảm bảo dữ liệu được lưu vào Microsoft Access ngay lập tức.</w:t>
       </w:r>
     </w:p>
     <w:p>
@@ -4306,7 +2729,6 @@
         <w:spacing w:after="120" w:before="280" w:line="360"/>
         <w:jc w:val="left"/>
       </w:pPr>
-      <w:bookmarkStart w:id="100015" w:name="_Toc100015"/>
       <w:r>
         <w:rPr>
           <w:rFonts w:ascii="Times New Roman" w:eastAsia="Times New Roman"/>
@@ -4318,7 +2740,6 @@
         </w:rPr>
         <w:t xml:space="preserve">3.6. Framework CSS Tailwind CSS</w:t>
       </w:r>
-      <w:bookmarkEnd w:id="100015"/>
     </w:p>
     <w:p>
       <w:pPr>
@@ -4486,7 +2907,6 @@
         <w:spacing w:after="160" w:before="360" w:line="360"/>
         <w:jc w:val="left"/>
       </w:pPr>
-      <w:bookmarkStart w:id="100016" w:name="_Toc100016"/>
       <w:r>
         <w:rPr>
           <w:rFonts w:ascii="Times New Roman" w:eastAsia="Times New Roman"/>
@@ -4498,7 +2918,6 @@
         </w:rPr>
         <w:t xml:space="preserve">CHƯƠNG 4: Phân tích, thiết kế và xây dựng hệ thống quản lý nhà hàng</w:t>
       </w:r>
-      <w:bookmarkEnd w:id="100016"/>
     </w:p>
     <w:p>
       <w:pPr>
@@ -4506,7 +2925,6 @@
         <w:spacing w:after="120" w:before="280" w:line="360"/>
         <w:jc w:val="left"/>
       </w:pPr>
-      <w:bookmarkStart w:id="100017" w:name="_Toc100017"/>
       <w:r>
         <w:rPr>
           <w:rFonts w:ascii="Times New Roman" w:eastAsia="Times New Roman"/>
@@ -4518,7 +2936,6 @@
         </w:rPr>
         <w:t xml:space="preserve">4.1. Thực trạng quản lý nhà hàng hiện nay</w:t>
       </w:r>
-      <w:bookmarkEnd w:id="100017"/>
     </w:p>
     <w:p>
       <w:pPr>
@@ -4646,7 +3063,6 @@
         <w:spacing w:after="120" w:before="280" w:line="360"/>
         <w:jc w:val="left"/>
       </w:pPr>
-      <w:bookmarkStart w:id="100018" w:name="_Toc100018"/>
       <w:r>
         <w:rPr>
           <w:rFonts w:ascii="Times New Roman" w:eastAsia="Times New Roman"/>
@@ -4658,7 +3074,6 @@
         </w:rPr>
         <w:t xml:space="preserve">4.2. Ưu điểm và khuyết điểm của hệ thống quản lý nhà hàng tự động</w:t>
       </w:r>
-      <w:bookmarkEnd w:id="100018"/>
     </w:p>
     <w:p>
       <w:pPr>
@@ -4946,7 +3361,6 @@
         <w:spacing w:after="120" w:before="280" w:line="360"/>
         <w:jc w:val="left"/>
       </w:pPr>
-      <w:bookmarkStart w:id="100019" w:name="_Toc100019"/>
       <w:r>
         <w:rPr>
           <w:rFonts w:ascii="Times New Roman" w:eastAsia="Times New Roman"/>
@@ -4958,7 +3372,6 @@
         </w:rPr>
         <w:t xml:space="preserve">4.3. Tính năng</w:t>
       </w:r>
-      <w:bookmarkEnd w:id="100019"/>
     </w:p>
     <w:p>
       <w:pPr>
@@ -5670,7 +4083,6 @@
         <w:spacing w:after="120" w:before="280" w:line="360"/>
         <w:jc w:val="left"/>
       </w:pPr>
-      <w:bookmarkStart w:id="100020" w:name="_Toc100020"/>
       <w:r>
         <w:rPr>
           <w:rFonts w:ascii="Times New Roman" w:eastAsia="Times New Roman"/>
@@ -5682,7 +4094,6 @@
         </w:rPr>
         <w:t xml:space="preserve">4.4. Xây dựng hệ thống ban đầu</w:t>
       </w:r>
-      <w:bookmarkEnd w:id="100020"/>
     </w:p>
     <w:p>
       <w:pPr>
@@ -5710,7 +4121,6 @@
         <w:spacing w:after="100" w:before="220" w:line="360"/>
         <w:jc w:val="left"/>
       </w:pPr>
-      <w:bookmarkStart w:id="100021" w:name="_Toc100021"/>
       <w:r>
         <w:rPr>
           <w:rFonts w:ascii="Times New Roman" w:eastAsia="Times New Roman"/>
@@ -5722,7 +4132,6 @@
         </w:rPr>
         <w:t xml:space="preserve">4.4.1. Bảng Ban</w:t>
       </w:r>
-      <w:bookmarkEnd w:id="100021"/>
     </w:p>
     <w:p>
       <w:pPr>
@@ -5813,7 +4222,6 @@
         <w:spacing w:after="100" w:before="220" w:line="360"/>
         <w:jc w:val="left"/>
       </w:pPr>
-      <w:bookmarkStart w:id="100022" w:name="_Toc100022"/>
       <w:r>
         <w:rPr>
           <w:rFonts w:ascii="Times New Roman" w:eastAsia="Times New Roman"/>
@@ -5825,7 +4233,6 @@
         </w:rPr>
         <w:t xml:space="preserve">4.4.2. Bảng SanPham</w:t>
       </w:r>
-      <w:bookmarkEnd w:id="100022"/>
     </w:p>
     <w:p>
       <w:pPr>
@@ -5916,7 +4323,6 @@
         <w:spacing w:after="100" w:before="220" w:line="360"/>
         <w:jc w:val="left"/>
       </w:pPr>
-      <w:bookmarkStart w:id="100023" w:name="_Toc100023"/>
       <w:r>
         <w:rPr>
           <w:rFonts w:ascii="Times New Roman" w:eastAsia="Times New Roman"/>
@@ -5928,7 +4334,6 @@
         </w:rPr>
         <w:t xml:space="preserve">4.4.3. Bảng HoaDon</w:t>
       </w:r>
-      <w:bookmarkEnd w:id="100023"/>
     </w:p>
     <w:p>
       <w:pPr>
@@ -6019,7 +4424,6 @@
         <w:spacing w:after="100" w:before="220" w:line="360"/>
         <w:jc w:val="left"/>
       </w:pPr>
-      <w:bookmarkStart w:id="100024" w:name="_Toc100024"/>
       <w:r>
         <w:rPr>
           <w:rFonts w:ascii="Times New Roman" w:eastAsia="Times New Roman"/>
@@ -6031,7 +4435,6 @@
         </w:rPr>
         <w:t xml:space="preserve">4.4.4. Bảng ChiTietHoaDon</w:t>
       </w:r>
-      <w:bookmarkEnd w:id="100024"/>
     </w:p>
     <w:p>
       <w:pPr>
@@ -6122,7 +4525,6 @@
         <w:spacing w:after="100" w:before="220" w:line="360"/>
         <w:jc w:val="left"/>
       </w:pPr>
-      <w:bookmarkStart w:id="100025" w:name="_Toc100025"/>
       <w:r>
         <w:rPr>
           <w:rFonts w:ascii="Times New Roman" w:eastAsia="Times New Roman"/>
@@ -6134,7 +4536,6 @@
         </w:rPr>
         <w:t xml:space="preserve">4.4.5. Bảng NguoiDung</w:t>
       </w:r>
-      <w:bookmarkEnd w:id="100025"/>
     </w:p>
     <w:p>
       <w:pPr>
@@ -6225,7 +4626,6 @@
         <w:spacing w:after="120" w:before="280" w:line="360"/>
         <w:jc w:val="left"/>
       </w:pPr>
-      <w:bookmarkStart w:id="100026" w:name="_Toc100026"/>
       <w:r>
         <w:rPr>
           <w:rFonts w:ascii="Times New Roman" w:eastAsia="Times New Roman"/>
@@ -6237,7 +4637,6 @@
         </w:rPr>
         <w:t xml:space="preserve">4.5. Relationship (Sơ đồ quan hệ thực thể)</w:t>
       </w:r>
-      <w:bookmarkEnd w:id="100026"/>
     </w:p>
     <w:p>
       <w:pPr>
@@ -6328,7 +4727,6 @@
         <w:spacing w:after="120" w:before="280" w:line="360"/>
         <w:jc w:val="left"/>
       </w:pPr>
-      <w:bookmarkStart w:id="100027" w:name="_Toc100027"/>
       <w:r>
         <w:rPr>
           <w:rFonts w:ascii="Times New Roman" w:eastAsia="Times New Roman"/>
@@ -6340,7 +4738,6 @@
         </w:rPr>
         <w:t xml:space="preserve">4.6. Nhập dữ liệu cho các bảng</w:t>
       </w:r>
-      <w:bookmarkEnd w:id="100027"/>
     </w:p>
     <w:p>
       <w:pPr>
@@ -6368,7 +4765,6 @@
         <w:spacing w:after="100" w:before="220" w:line="360"/>
         <w:jc w:val="left"/>
       </w:pPr>
-      <w:bookmarkStart w:id="100028" w:name="_Toc100028"/>
       <w:r>
         <w:rPr>
           <w:rFonts w:ascii="Times New Roman" w:eastAsia="Times New Roman"/>
@@ -6380,7 +4776,6 @@
         </w:rPr>
         <w:t xml:space="preserve">4.6.1. Bảng Ban</w:t>
       </w:r>
-      <w:bookmarkEnd w:id="100028"/>
     </w:p>
     <w:p>
       <w:pPr>
@@ -6471,7 +4866,6 @@
         <w:spacing w:after="100" w:before="220" w:line="360"/>
         <w:jc w:val="left"/>
       </w:pPr>
-      <w:bookmarkStart w:id="100029" w:name="_Toc100029"/>
       <w:r>
         <w:rPr>
           <w:rFonts w:ascii="Times New Roman" w:eastAsia="Times New Roman"/>
@@ -6483,7 +4877,6 @@
         </w:rPr>
         <w:t xml:space="preserve">4.6.2. Bảng SanPham</w:t>
       </w:r>
-      <w:bookmarkEnd w:id="100029"/>
     </w:p>
     <w:p>
       <w:pPr>
@@ -6574,7 +4967,6 @@
         <w:spacing w:after="100" w:before="220" w:line="360"/>
         <w:jc w:val="left"/>
       </w:pPr>
-      <w:bookmarkStart w:id="100030" w:name="_Toc100030"/>
       <w:r>
         <w:rPr>
           <w:rFonts w:ascii="Times New Roman" w:eastAsia="Times New Roman"/>
@@ -6586,7 +4978,6 @@
         </w:rPr>
         <w:t xml:space="preserve">4.6.3. Bảng HoaDon</w:t>
       </w:r>
-      <w:bookmarkEnd w:id="100030"/>
     </w:p>
     <w:p>
       <w:pPr>
@@ -6677,7 +5068,6 @@
         <w:spacing w:after="100" w:before="220" w:line="360"/>
         <w:jc w:val="left"/>
       </w:pPr>
-      <w:bookmarkStart w:id="100031" w:name="_Toc100031"/>
       <w:r>
         <w:rPr>
           <w:rFonts w:ascii="Times New Roman" w:eastAsia="Times New Roman"/>
@@ -6689,7 +5079,6 @@
         </w:rPr>
         <w:t xml:space="preserve">4.6.4. Bảng ChiTietHoaDon</w:t>
       </w:r>
-      <w:bookmarkEnd w:id="100031"/>
     </w:p>
     <w:p>
       <w:pPr>
@@ -6780,7 +5169,6 @@
         <w:spacing w:after="100" w:before="220" w:line="360"/>
         <w:jc w:val="left"/>
       </w:pPr>
-      <w:bookmarkStart w:id="100032" w:name="_Toc100032"/>
       <w:r>
         <w:rPr>
           <w:rFonts w:ascii="Times New Roman" w:eastAsia="Times New Roman"/>
@@ -6792,7 +5180,6 @@
         </w:rPr>
         <w:t xml:space="preserve">4.6.5. Bảng NguoiDung</w:t>
       </w:r>
-      <w:bookmarkEnd w:id="100032"/>
     </w:p>
     <w:p>
       <w:pPr>
@@ -6883,7 +5270,6 @@
         <w:spacing w:after="120" w:before="280" w:line="360"/>
         <w:jc w:val="left"/>
       </w:pPr>
-      <w:bookmarkStart w:id="100033" w:name="_Toc100033"/>
       <w:r>
         <w:rPr>
           <w:rFonts w:ascii="Times New Roman" w:eastAsia="Times New Roman"/>
@@ -6895,7 +5281,6 @@
         </w:rPr>
         <w:t xml:space="preserve">4.7. Giao diện</w:t>
       </w:r>
-      <w:bookmarkEnd w:id="100033"/>
     </w:p>
     <w:p>
       <w:pPr>
@@ -6923,7 +5308,6 @@
         <w:spacing w:after="100" w:before="220" w:line="360"/>
         <w:jc w:val="left"/>
       </w:pPr>
-      <w:bookmarkStart w:id="100034" w:name="_Toc100034"/>
       <w:r>
         <w:rPr>
           <w:rFonts w:ascii="Times New Roman" w:eastAsia="Times New Roman"/>
@@ -6935,7 +5319,6 @@
         </w:rPr>
         <w:t xml:space="preserve">4.7.1. Giao diện đăng nhập</w:t>
       </w:r>
-      <w:bookmarkEnd w:id="100034"/>
     </w:p>
     <w:p>
       <w:pPr>
@@ -7026,7 +5409,6 @@
         <w:spacing w:after="100" w:before="220" w:line="360"/>
         <w:jc w:val="left"/>
       </w:pPr>
-      <w:bookmarkStart w:id="100035" w:name="_Toc100035"/>
       <w:r>
         <w:rPr>
           <w:rFonts w:ascii="Times New Roman" w:eastAsia="Times New Roman"/>
@@ -7038,7 +5420,6 @@
         </w:rPr>
         <w:t xml:space="preserve">4.7.2. Giao diện Sơ đồ bàn</w:t>
       </w:r>
-      <w:bookmarkEnd w:id="100035"/>
     </w:p>
     <w:p>
       <w:pPr>
@@ -7129,7 +5510,6 @@
         <w:spacing w:after="100" w:before="220" w:line="360"/>
         <w:jc w:val="left"/>
       </w:pPr>
-      <w:bookmarkStart w:id="100036" w:name="_Toc100036"/>
       <w:r>
         <w:rPr>
           <w:rFonts w:ascii="Times New Roman" w:eastAsia="Times New Roman"/>
@@ -7141,7 +5521,6 @@
         </w:rPr>
         <w:t xml:space="preserve">4.7.3. Giao diện Gọi món</w:t>
       </w:r>
-      <w:bookmarkEnd w:id="100036"/>
     </w:p>
     <w:p>
       <w:pPr>
@@ -7232,7 +5611,6 @@
         <w:spacing w:after="100" w:before="220" w:line="360"/>
         <w:jc w:val="left"/>
       </w:pPr>
-      <w:bookmarkStart w:id="100037" w:name="_Toc100037"/>
       <w:r>
         <w:rPr>
           <w:rFonts w:ascii="Times New Roman" w:eastAsia="Times New Roman"/>
@@ -7244,7 +5622,6 @@
         </w:rPr>
         <w:t xml:space="preserve">4.7.4. Giao diện Thực đơn</w:t>
       </w:r>
-      <w:bookmarkEnd w:id="100037"/>
     </w:p>
     <w:p>
       <w:pPr>
@@ -7335,7 +5712,6 @@
         <w:spacing w:after="100" w:before="220" w:line="360"/>
         <w:jc w:val="left"/>
       </w:pPr>
-      <w:bookmarkStart w:id="100038" w:name="_Toc100038"/>
       <w:r>
         <w:rPr>
           <w:rFonts w:ascii="Times New Roman" w:eastAsia="Times New Roman"/>
@@ -7347,7 +5723,6 @@
         </w:rPr>
         <w:t xml:space="preserve">4.7.5. Giao diện Lịch sử</w:t>
       </w:r>
-      <w:bookmarkEnd w:id="100038"/>
     </w:p>
     <w:p>
       <w:pPr>
@@ -7438,7 +5813,6 @@
         <w:spacing w:after="100" w:before="220" w:line="360"/>
         <w:jc w:val="left"/>
       </w:pPr>
-      <w:bookmarkStart w:id="100039" w:name="_Toc100039"/>
       <w:r>
         <w:rPr>
           <w:rFonts w:ascii="Times New Roman" w:eastAsia="Times New Roman"/>
@@ -7450,7 +5824,6 @@
         </w:rPr>
         <w:t xml:space="preserve">4.7.6. Giao diện Báo cáo</w:t>
       </w:r>
-      <w:bookmarkEnd w:id="100039"/>
     </w:p>
     <w:p>
       <w:pPr>
@@ -7541,7 +5914,6 @@
         <w:spacing w:after="160" w:before="360" w:line="360"/>
         <w:jc w:val="left"/>
       </w:pPr>
-      <w:bookmarkStart w:id="100040" w:name="_Toc100040"/>
       <w:r>
         <w:rPr>
           <w:rFonts w:ascii="Times New Roman" w:eastAsia="Times New Roman"/>
@@ -7553,7 +5925,6 @@
         </w:rPr>
         <w:t xml:space="preserve">CHƯƠNG 5: Đánh giá và định hướng phát triển</w:t>
       </w:r>
-      <w:bookmarkEnd w:id="100040"/>
     </w:p>
     <w:p>
       <w:pPr>
@@ -7561,7 +5932,6 @@
         <w:spacing w:after="120" w:before="280" w:line="360"/>
         <w:jc w:val="left"/>
       </w:pPr>
-      <w:bookmarkStart w:id="100041" w:name="_Toc100041"/>
       <w:r>
         <w:rPr>
           <w:rFonts w:ascii="Times New Roman" w:eastAsia="Times New Roman"/>
@@ -7573,7 +5943,6 @@
         </w:rPr>
         <w:t xml:space="preserve">5.1. Đánh giá</w:t>
       </w:r>
-      <w:bookmarkEnd w:id="100041"/>
     </w:p>
     <w:p>
       <w:pPr>
@@ -7621,7 +5990,6 @@
         <w:spacing w:after="120" w:before="280" w:line="360"/>
         <w:jc w:val="left"/>
       </w:pPr>
-      <w:bookmarkStart w:id="100042" w:name="_Toc100042"/>
       <w:r>
         <w:rPr>
           <w:rFonts w:ascii="Times New Roman" w:eastAsia="Times New Roman"/>
@@ -7633,7 +6001,6 @@
         </w:rPr>
         <w:t xml:space="preserve">5.2. Định hướng phát triển</w:t>
       </w:r>
-      <w:bookmarkEnd w:id="100042"/>
     </w:p>
     <w:p>
       <w:pPr>
@@ -8020,9 +6387,6 @@
     </w:rPr>
   </w:style>
   <w:style w:type="paragraph" w:styleId="Heading1">
-    <w:pPr>
-      <w:outlineLvl w:val="0"/>
-    </w:pPr>
     <w:name w:val="Heading 1"/>
     <w:basedOn w:val="Normal"/>
     <w:next w:val="Normal"/>
@@ -8034,9 +6398,6 @@
     </w:rPr>
   </w:style>
   <w:style w:type="paragraph" w:styleId="Heading2">
-    <w:pPr>
-      <w:outlineLvl w:val="1"/>
-    </w:pPr>
     <w:name w:val="Heading 2"/>
     <w:basedOn w:val="Normal"/>
     <w:next w:val="Normal"/>
@@ -8048,9 +6409,6 @@
     </w:rPr>
   </w:style>
   <w:style w:type="paragraph" w:styleId="Heading3">
-    <w:pPr>
-      <w:outlineLvl w:val="2"/>
-    </w:pPr>
     <w:name w:val="Heading 3"/>
     <w:basedOn w:val="Normal"/>
     <w:next w:val="Normal"/>
@@ -8062,9 +6420,6 @@
     </w:rPr>
   </w:style>
   <w:style w:type="paragraph" w:styleId="Heading4">
-    <w:pPr>
-      <w:outlineLvl w:val="3"/>
-    </w:pPr>
     <w:name w:val="Heading 4"/>
     <w:basedOn w:val="Normal"/>
     <w:next w:val="Normal"/>
@@ -8076,9 +6431,6 @@
     </w:rPr>
   </w:style>
   <w:style w:type="paragraph" w:styleId="Heading5">
-    <w:pPr>
-      <w:outlineLvl w:val="4"/>
-    </w:pPr>
     <w:name w:val="Heading 5"/>
     <w:basedOn w:val="Normal"/>
     <w:next w:val="Normal"/>
@@ -8088,9 +6440,6 @@
     </w:rPr>
   </w:style>
   <w:style w:type="paragraph" w:styleId="Heading6">
-    <w:pPr>
-      <w:outlineLvl w:val="5"/>
-    </w:pPr>
     <w:name w:val="Heading 6"/>
     <w:basedOn w:val="Normal"/>
     <w:next w:val="Normal"/>
@@ -8252,44 +6601,5 @@
       <w:szCs w:val="26"/>
     </w:rPr>
   </w:style>
-  <w:style xmlns:w="http://schemas.openxmlformats.org/wordprocessingml/2006/main" w:type="paragraph" w:styleId="9">
-    <w:name w:val="toc 1"/>
-    <w:basedOn w:val="Normal"/>
-    <w:uiPriority w:val="39"/>
-    <w:pPr>
-      <w:tabs>
-        <w:tab w:val="right" w:leader="dot" w:pos="9026"/>
-      </w:tabs>
-      <w:spacing w:before="120" w:after="60"/>
-    </w:pPr>
-    <w:rPr>
-      <w:b/>
-      <w:bCs/>
-    </w:rPr>
-  </w:style>
-  <w:style xmlns:w="http://schemas.openxmlformats.org/wordprocessingml/2006/main" w:type="paragraph" w:styleId="11">
-    <w:name w:val="toc 2"/>
-    <w:basedOn w:val="Normal"/>
-    <w:uiPriority w:val="39"/>
-    <w:pPr>
-      <w:tabs>
-        <w:tab w:val="right" w:leader="dot" w:pos="9026"/>
-      </w:tabs>
-      <w:ind w:left="360"/>
-      <w:spacing w:before="60" w:after="40"/>
-    </w:pPr>
-  </w:style>
-  <w:style xmlns:w="http://schemas.openxmlformats.org/wordprocessingml/2006/main" w:type="paragraph" w:styleId="12">
-    <w:name w:val="toc 3"/>
-    <w:basedOn w:val="Normal"/>
-    <w:uiPriority w:val="39"/>
-    <w:pPr>
-      <w:tabs>
-        <w:tab w:val="right" w:leader="dot" w:pos="9026"/>
-      </w:tabs>
-      <w:ind w:left="720"/>
-      <w:spacing w:before="40" w:after="20"/>
-    </w:pPr>
-  </w:style>
 </w:styles>
 </file>
</xml_diff>

<commit_message>
Bỏ SHA-256 hash mật khẩu + thêm ghi chú tiếng Việt cho 100% code
THAY ĐỔI LỚN:
- Xoá file MatKhauBaoMat.cs (không còn băm SHA-256)
- Đổi tên cột DB MatKhauHash → MatKhau (lưu plain-text)
- ApiTaiKhoan.cs: so sánh mật khẩu plain-text trực tiếp
- NguoiDungDAL.cs: đổi SQL column MatKhauHash → MatKhau
- Tái tạo cả 2 file .accdb với schema mới (Jackcess)
- 3 user mẫu: admin/admin123, huy/huy123456, nhanvien1/123456

GHI CHÚ CHO 100% CODE (phục vụ thi vấn đáp 1-1):
- Tất cả .cs files: Entities (7), DAL (6), CacModun (7), Program.cs
- Tất cả .js files: common, sidebar, ban, menu, order, lichsu, baocao
- tao_access.java + access_db/README.md

TÀI LIỆU CẬP NHẬT:
- BaoCaoDoAnCuoiKi_*.docx: bỏ SHA-256, ghi chú plain-text
- KeHoachSlidePowerPoint_*.docx: bỏ SHA-256, sửa slide bảo mật
- README.md: thêm CacModun/ + NguoiDung.cs vào sơ đồ cây

LỢI ÍCH CHO HỌC SINH:
- Tự thêm/sửa tài khoản, bàn, món ăn trực tiếp trong Access
- Kết quả tự cập nhật lên UI khi reload trang
</commit_message>
<xml_diff>
--- a/BaoCaoDoAnCuoiKi_QuanLyNhaHang_HoQuangHuy.docx
+++ b/BaoCaoDoAnCuoiKi_QuanLyNhaHang_HoQuangHuy.docx
@@ -1077,7 +1077,7 @@
                 <w:sz w:val="24"/>
                 <w:szCs w:val="24"/>
               </w:rPr>
-              <w:t xml:space="preserve">Xây dựng các API endpoint (ApiBan, ApiSanPham, ApiHoaDon, ApiTaiKhoan, ApiBaoCao) và module bảo mật SHA-256</w:t>
+              <w:t xml:space="preserve">Xây dựng các API endpoint (ApiBan, ApiSanPham, ApiHoaDon, ApiTaiKhoan, ApiBaoCao) - mật khẩu lưu plain-text để học sinh tự thêm/sửa trong Access</w:t>
             </w:r>
           </w:p>
         </w:tc>
@@ -1482,7 +1482,7 @@
           <w:sz w:val="26"/>
           <w:szCs w:val="26"/>
         </w:rPr>
-        <w:t xml:space="preserve">Bên cạnh mục tiêu ứng dụng, đồ án còn mang mục tiêu học thuật là vận dụng đầy đủ bốn nguyên lý của lập trình hướng đối tượng (đóng gói, kế thừa, đa hình, trừu tượng) vào việc thiết kế các lớp thực thể, xây dựng tầng DAL theo interface, áp dụng mô hình 3 lớp (Entity – DAL – GUI) và thực hành các nguyên tắc bảo mật cơ bản như băm mật khẩu SHA-256, dùng parameterized query để chống SQL Injection. Qua đó, sinh viên có cái nhìn tổng thể về một quy trình phát triển phần mềm từ khi phân tích đến khi đóng gói sản phẩm.</w:t>
+        <w:t xml:space="preserve">Bên cạnh mục tiêu ứng dụng, đồ án còn mang mục tiêu học thuật là vận dụng đầy đủ bốn nguyên lý của lập trình hướng đối tượng (đóng gói, kế thừa, đa hình, trừu tượng) vào việc thiết kế các lớp thực thể, xây dựng tầng DAL theo interface, áp dụng mô hình 3 lớp (Entity – DAL – GUI) và thực hành các nguyên tắc bảo mật cơ bản như dùng parameterized query để chống SQL Injection, đặt khối try-catch khi mở kết nối cơ sở dữ liệu. Qua đó, sinh viên có cái nhìn tổng thể về một quy trình phát triển phần mềm từ khi phân tích đến khi đóng gói sản phẩm.</w:t>
       </w:r>
     </w:p>
     <w:p>
@@ -1640,7 +1640,7 @@
           <w:sz w:val="26"/>
           <w:szCs w:val="26"/>
         </w:rPr>
-        <w:t xml:space="preserve">Bảo mật và an toàn dữ liệu: Hệ thống phải băm mật khẩu bằng SHA-256 trước khi lưu, dùng parameterized queries cho mọi câu lệnh SQL để chống SQL Injection, và đặt khối try-catch-finally khi mở kết nối cơ sở dữ liệu.</w:t>
+        <w:t xml:space="preserve">Bảo mật và an toàn dữ liệu: Hệ thống dùng parameterized queries cho mọi câu lệnh SQL (tham số vị trí ‘?’ của OLE DB) để chống SQL Injection, đặt khối try-catch khi mở kết nối cơ sở dữ liệu. Mật khẩu lưu plain-text (không băm) — đây là lựa chọn tối giản hoá cho đồ án nhỏ, giúp học sinh có thể tự thêm/sửa tài khoản trực tiếp trong file Access mà không cần tính hash.</w:t>
       </w:r>
     </w:p>
     <w:p>
@@ -3232,7 +3232,7 @@
           <w:sz w:val="26"/>
           <w:szCs w:val="26"/>
         </w:rPr>
-        <w:t xml:space="preserve">Mật khẩu được băm SHA-256: Không lưu mật khẩu thô, chống rò rỉ thông tin đăng nhập ngay cả khi cơ sở dữ liệu bị lộ.</w:t>
+        <w:t xml:space="preserve">Mật khẩu lưu plain-text: Đơn giản hoá cho đồ án nhỏ — học sinh có thể tự thêm/sửa tài khoản, bàn, món ăn trực tiếp trong file Access và kết quả sẽ tự cập nhật lên giao diện khi reload trang.</w:t>
       </w:r>
     </w:p>
     <w:p>
@@ -3468,7 +3468,7 @@
           <w:sz w:val="26"/>
           <w:szCs w:val="26"/>
         </w:rPr>
-        <w:t xml:space="preserve">Thêm tài khoản người dùng mới (mật khẩu tự động băm SHA-256 trước khi lưu).</w:t>
+        <w:t xml:space="preserve">Thêm tài khoản người dùng mới (mật khẩu lưu plain-text).</w:t>
       </w:r>
     </w:p>
     <w:p>
@@ -4554,7 +4554,7 @@
           <w:sz w:val="26"/>
           <w:szCs w:val="26"/>
         </w:rPr>
-        <w:t xml:space="preserve">Bảng NguoiDung lưu tài khoản đăng nhập. Có Id (PK), TenDangNhap (UNIQUE), MatKhauHash (đã băm SHA-256), VaiTro (‘QuanTri’ hoặc ‘NhanVien’), NgayTao.</w:t>
+        <w:t xml:space="preserve">Bảng NguoiDung lưu tài khoản đăng nhập. Có Id (PK), TenDangNhap (UNIQUE), MatKhau (lưu plain-text, không băm — để học sinh tự thêm/sửa trong Access), VaiTro (‘QuanTri’ hoặc ‘NhanVien’), NgayTao.</w:t>
       </w:r>
     </w:p>
     <w:p>
@@ -5198,7 +5198,7 @@
           <w:sz w:val="26"/>
           <w:szCs w:val="26"/>
         </w:rPr>
-        <w:t xml:space="preserve">Dữ liệu mẫu bảng NguoiDung gồm tài khoản admin (QuanTri) và nhanvien1 (NhanVien), mật khẩu lưu dưới dạng SHA-256 hash.</w:t>
+        <w:t xml:space="preserve">Dữ liệu mẫu bảng NguoiDung gồm tài khoản admin (QuanTri, mật khẩu admin123), huy (QuanTri, mật khẩu huy123456) và nhanvien1 (NhanVien, mật khẩu 123456). Mật khẩu lưu plain-text để dễ quản lý.</w:t>
       </w:r>
     </w:p>
     <w:p>
@@ -5337,7 +5337,7 @@
           <w:sz w:val="26"/>
           <w:szCs w:val="26"/>
         </w:rPr>
-        <w:t xml:space="preserve">Trang đăng nhập với hai ô nhập tên đăng nhập và mật khẩu, có nút Đăng nhập và Đăng ký. Mật khẩu được băm SHA-256 và so sánh với cơ sở dữ liệu. Nếu sai, hiển thị thông báo lỗi; nếu đúng, chuyển vào trang chính theo vai trò.</w:t>
+        <w:t xml:space="preserve">Trang đăng nhập với hai ô nhập tên đăng nhập và mật khẩu, có nút Đăng nhập và Đăng ký. Mật khẩu lưu plain-text trong Access và được so sánh trực tiếp. Nếu sai, hiển thị thông báo lỗi; nếu đúng, chuyển vào trang chính theo vai trò. Học sinh có thể tự thêm tài khoản mới trong file Access mà không cần tính hash.</w:t>
       </w:r>
     </w:p>
     <w:p>
@@ -6001,7 +6001,7 @@
           <w:sz w:val="26"/>
           <w:szCs w:val="26"/>
         </w:rPr>
-        <w:t xml:space="preserve">Về mặt kiểm thử, đồ án đã được verify kỹ lưỡng trước khi bàn giao. Build dotnet build PASS với 0 errors. Do môi trường Linux không chạy được OLE DB provider (Windows-only), đã tạo test harness Java dùng thư viện Jackcess để đọc trực tiếp file .accdb và mô phỏng toàn bộ query DAL. Kết quả 59/59 test PASS: verify schema (5 bảng, 30+ cột), dữ liệu mẫu (3 user, 10 bàn, 12 sản phẩm, 5 hóa đơn, 14 chi tiết), đa hình ThucAn/NuocUong, 3 quan hệ khóa ngoại, toàn vẹn tham chiếu. Quá trình kiểm thử cũng phát hiện và sửa 2 lỗi nghiêm trọng: hash mật khẩu admin/huy bị sai (không đăng nhập được) và lỗi 'Data type mismatch in criteria expression' khi đăng ký do dùng AddWithValue — đã fix bằng OleDbType tường minh.</w:t>
+        <w:t xml:space="preserve">Về mặt kiểm thử, đồ án đã được verify kỹ lưỡng trước khi bàn giao. Build dotnet build PASS với 0 errors. Do môi trường Linux không chạy được OLE DB provider (Windows-only), đã tạo test harness Java dùng thư viện Jackcess để đọc trực tiếp file .accdb và mô phỏng toàn bộ query DAL. Kết quả 59/59 test PASS: verify schema (5 bảng, 30+ cột), dữ liệu mẫu (3 user, 10 bàn, 12 sản phẩm, 5 hóa đơn, 14 chi tiết), đa hình ThucAn/NuocUong, 3 quan hệ khóa ngoại, toàn vẹn tham chiếu. Quá trình kiểm thử cũng phát hiện và sửa lỗi 'Data type mismatch in criteria expression' khi đăng ký do dùng AddWithValue — đã fix bằng Parameters.Add(name, OleDbType.X).Value với OleDbType tường minh (VarWChar, Integer, Currency, Date, Boolean).</w:t>
       </w:r>
     </w:p>
     <w:p>

</xml_diff>

<commit_message>
Bổ sung mục 4.3.1 Sơ đồ Use Case (Hình 4.1) + renumber 17 hình còn lại (4.1→4.2 ... 4.17→4.18)
- Thêm sơ đồ Use Case UML 2.5 với 2 actor (QuanTri, NhanVien) và 9 use case
- 3 quan hệ: 2 «include» (Gọi món → Đổi trạng thái bàn; Thanh toán → Xem lịch sử) và 1 «extend» (Báo cáo → Lịch sử)
- 4 đoạn mô tả chi tiết về actor, use case, quan hệ include/extend và ánh xạ sang API endpoint
- Đánh số lại 17 caption hình cũ để Use Case trở thành Hình 4.1
</commit_message>
<xml_diff>
--- a/BaoCaoDoAnCuoiKi_QuanLyNhaHang_HoQuangHuy.docx
+++ b/BaoCaoDoAnCuoiKi_QuanLyNhaHang_HoQuangHuy.docx
@@ -4079,6 +4079,98 @@
     </w:p>
     <w:p>
       <w:pPr>
+        <w:pStyle w:val="Heading3"/>
+      </w:pPr>
+      <w:r>
+        <w:t xml:space="preserve">4.3.1. Sơ đồ Use Case (Use Case Diagram)</w:t>
+      </w:r>
+    </w:p>
+    <w:p>
+      <w:pPr>
+        <w:jc w:val="both"/>
+      </w:pPr>
+      <w:r>
+        <w:t xml:space="preserve">Sơ đồ Use Case (Use Case Diagram) mô tả các chức năng mà hệ thống cung cấp dưới góc nhìn của người dùng, bao gồm các tác nhân (actor) tương tác với hệ thống và các trường hợp sử dụng (use case) mà họ có thể thực hiện. Trong hệ thống Quản lý Nhà hàng, có hai tác nhân chính là Quản trị viên (vai trò QuanTri) và Nhân viên (vai trò NhanVien). Sơ đồ này được vẽ theo chuẩn UML 2.5, trong đó tác nhân được biểu diễn bằng hình người, use case bằng hình elip, và toàn bộ hệ thống được đóng khung bởi một đường bao hệ thống (system boundary).</w:t>
+      </w:r>
+    </w:p>
+    <w:p>
+      <w:pPr>
+        <w:jc w:val="both"/>
+      </w:pPr>
+      <w:r>
+        <w:t xml:space="preserve">Tác nhân Quản trị viên có toàn quyền trên hệ thống: đăng nhập, xem sơ đồ bàn, thanh toán hóa đơn, xem lịch sử, xem báo cáo doanh thu, quản lý thực đơn (thêm/sửa/xóa món ăn và nước uống), quản lý tài khoản (thêm/sửa người dùng), và đổi trạng thái bàn (Trống ↔ Đang phục vụ). Tác nhân Nhân viên có quyền hạn hẹp hơn: chỉ thực hiện đăng nhập, xem sơ đồ bàn, gọi món cho bàn, thanh toán hóa đơn và xem lịch sử. Phân quyền này được kiểm soát tại tầng API thông qua thuộc tính VaiTro trong bảng NguoiDung, và mỗi endpoint nhạy cảm đều kiểm tra vai trò trước khi xử lý.</w:t>
+      </w:r>
+    </w:p>
+    <w:p>
+      <w:pPr>
+        <w:jc w:val="both"/>
+      </w:pPr>
+      <w:r>
+        <w:t xml:space="preserve">Sơ đồ còn thể hiện ba quan hệ mở rộng chuẩn UML: quan hệ «include» giữa "Gọi món cho bàn" và "Đổi trạng thái bàn" (mỗi khi nhân viên gọi món cho một bàn trống, hệ thống tự động chuyển bàn sang trạng thái "Đang phục vụ" — đây là hành vi bắt buộc, không thể tách rời); quan hệ «include» giữa "Thanh toán hóa đơn" và "Xem lịch sử hóa đơn" (sau khi thanh toán, hóa đơn được lưu vào lịch sử để truy vết sau này); và quan hệ «extend» giữa "Xem báo cáo doanh thu" và "Xem lịch sử hóa đơn" (báo cáo là phần mở rộng dựa trên dữ liệu lịch sử, chỉ khi người dùng chủ động yêu cầu mới thực hiện).</w:t>
+      </w:r>
+    </w:p>
+    <w:p>
+      <w:pPr>
+        <w:jc w:val="both"/>
+      </w:pPr>
+      <w:r>
+        <w:t xml:space="preserve">Sơ đồ Use Case này là cơ sở để thiết kế các API endpoint và kiểm thử chấp nhận (acceptance testing). Mỗi use case được ánh xạ thành một hoặc nhiều endpoint REST trong các lớp ApiBan, ApiSanPham, ApiHoaDon, ApiTaiKhoan và ApiBaoCao. Khi bảo trì hoặc mở rộng (ví dụ thêm chức năng đặt bàn trước, quản lý kho nguyên liệu), lập trình viên chỉ cần cập nhật sơ đồ Use Case trước, sau đó mới bổ sung code, đảm bảo tài liệu luôn khớp với hiện trạng hệ thống.</w:t>
+      </w:r>
+    </w:p>
+    <w:p>
+      <w:pPr>
+        <w:jc w:val="center"/>
+      </w:pPr>
+      <w:r>
+        <w:drawing>
+          <wp:inline xmlns:a="http://schemas.openxmlformats.org/drawingml/2006/main" xmlns:pic="http://schemas.openxmlformats.org/drawingml/2006/picture">
+            <wp:extent cx="5486400" cy="2470873"/>
+            <wp:docPr id="2" name="Picture 2"/>
+            <wp:cNvGraphicFramePr>
+              <a:graphicFrameLocks noChangeAspect="1"/>
+            </wp:cNvGraphicFramePr>
+            <a:graphic>
+              <a:graphicData uri="http://schemas.openxmlformats.org/drawingml/2006/picture">
+                <pic:pic>
+                  <pic:nvPicPr>
+                    <pic:cNvPr id="0" name="usecase_diagram.png"/>
+                    <pic:cNvPicPr/>
+                  </pic:nvPicPr>
+                  <pic:blipFill>
+                    <a:blip r:embed="rId27"/>
+                    <a:stretch>
+                      <a:fillRect/>
+                    </a:stretch>
+                  </pic:blipFill>
+                  <pic:spPr>
+                    <a:xfrm>
+                      <a:off x="0" y="0"/>
+                      <a:ext cx="5486400" cy="2470873"/>
+                    </a:xfrm>
+                    <a:prstGeom prst="rect"/>
+                  </pic:spPr>
+                </pic:pic>
+              </a:graphicData>
+            </a:graphic>
+          </wp:inline>
+        </w:drawing>
+      </w:r>
+    </w:p>
+    <w:p>
+      <w:pPr>
+        <w:jc w:val="center"/>
+      </w:pPr>
+      <w:r>
+        <w:rPr>
+          <w:b/>
+          <w:i/>
+          <w:sz w:val="22"/>
+        </w:rPr>
+        <w:t xml:space="preserve">Hình 4.1: Sơ đồ Use Case của hệ thống Quản lý Nhà hàng</w:t>
+      </w:r>
+    </w:p>
+    <w:p>
+      <w:pPr>
         <w:pStyle w:val="Heading2"/>
         <w:spacing w:after="120" w:before="280" w:line="360"/>
         <w:jc w:val="left"/>
@@ -4205,15 +4297,7 @@
         <w:jc w:val="center"/>
       </w:pPr>
       <w:r>
-        <w:rPr>
-          <w:rFonts w:ascii="Times New Roman" w:eastAsia="Times New Roman"/>
-          <w:i/>
-          <w:iCs/>
-          <w:color w:val="595959"/>
-          <w:sz w:val="22"/>
-          <w:szCs w:val="22"/>
-        </w:rPr>
-        <w:t xml:space="preserve">Hình 4.1: Cấu trúc bảng Ban</w:t>
+        <w:t>Hình 4.2: Cấu trúc bảng Ban</w:t>
       </w:r>
     </w:p>
     <w:p>
@@ -4306,15 +4390,7 @@
         <w:jc w:val="center"/>
       </w:pPr>
       <w:r>
-        <w:rPr>
-          <w:rFonts w:ascii="Times New Roman" w:eastAsia="Times New Roman"/>
-          <w:i/>
-          <w:iCs/>
-          <w:color w:val="595959"/>
-          <w:sz w:val="22"/>
-          <w:szCs w:val="22"/>
-        </w:rPr>
-        <w:t xml:space="preserve">Hình 4.2: Cấu trúc bảng SanPham</w:t>
+        <w:t>Hình 4.3: Cấu trúc bảng SanPham</w:t>
       </w:r>
     </w:p>
     <w:p>
@@ -4407,15 +4483,7 @@
         <w:jc w:val="center"/>
       </w:pPr>
       <w:r>
-        <w:rPr>
-          <w:rFonts w:ascii="Times New Roman" w:eastAsia="Times New Roman"/>
-          <w:i/>
-          <w:iCs/>
-          <w:color w:val="595959"/>
-          <w:sz w:val="22"/>
-          <w:szCs w:val="22"/>
-        </w:rPr>
-        <w:t xml:space="preserve">Hình 4.3: Cấu trúc bảng HoaDon</w:t>
+        <w:t>Hình 4.4: Cấu trúc bảng HoaDon</w:t>
       </w:r>
     </w:p>
     <w:p>
@@ -4508,15 +4576,7 @@
         <w:jc w:val="center"/>
       </w:pPr>
       <w:r>
-        <w:rPr>
-          <w:rFonts w:ascii="Times New Roman" w:eastAsia="Times New Roman"/>
-          <w:i/>
-          <w:iCs/>
-          <w:color w:val="595959"/>
-          <w:sz w:val="22"/>
-          <w:szCs w:val="22"/>
-        </w:rPr>
-        <w:t xml:space="preserve">Hình 4.4: Cấu trúc bảng ChiTietHoaDon</w:t>
+        <w:t>Hình 4.5: Cấu trúc bảng ChiTietHoaDon</w:t>
       </w:r>
     </w:p>
     <w:p>
@@ -4609,15 +4669,7 @@
         <w:jc w:val="center"/>
       </w:pPr>
       <w:r>
-        <w:rPr>
-          <w:rFonts w:ascii="Times New Roman" w:eastAsia="Times New Roman"/>
-          <w:i/>
-          <w:iCs/>
-          <w:color w:val="595959"/>
-          <w:sz w:val="22"/>
-          <w:szCs w:val="22"/>
-        </w:rPr>
-        <w:t xml:space="preserve">Hình 4.5: Cấu trúc bảng NguoiDung</w:t>
+        <w:t>Hình 4.6: Cấu trúc bảng NguoiDung</w:t>
       </w:r>
     </w:p>
     <w:p>
@@ -4710,15 +4762,7 @@
         <w:jc w:val="center"/>
       </w:pPr>
       <w:r>
-        <w:rPr>
-          <w:rFonts w:ascii="Times New Roman" w:eastAsia="Times New Roman"/>
-          <w:i/>
-          <w:iCs/>
-          <w:color w:val="595959"/>
-          <w:sz w:val="22"/>
-          <w:szCs w:val="22"/>
-        </w:rPr>
-        <w:t xml:space="preserve">Hình 4.6: Sơ đồ quan hệ thực thể (ER Diagram)</w:t>
+        <w:t>Hình 4.7: Sơ đồ quan hệ thực thể (ER Diagram)</w:t>
       </w:r>
     </w:p>
     <w:p>
@@ -4849,15 +4893,7 @@
         <w:jc w:val="center"/>
       </w:pPr>
       <w:r>
-        <w:rPr>
-          <w:rFonts w:ascii="Times New Roman" w:eastAsia="Times New Roman"/>
-          <w:i/>
-          <w:iCs/>
-          <w:color w:val="595959"/>
-          <w:sz w:val="22"/>
-          <w:szCs w:val="22"/>
-        </w:rPr>
-        <w:t xml:space="preserve">Hình 4.7: Dữ liệu mẫu bảng Ban</w:t>
+        <w:t>Hình 4.8: Dữ liệu mẫu bảng Ban</w:t>
       </w:r>
     </w:p>
     <w:p>
@@ -4950,15 +4986,7 @@
         <w:jc w:val="center"/>
       </w:pPr>
       <w:r>
-        <w:rPr>
-          <w:rFonts w:ascii="Times New Roman" w:eastAsia="Times New Roman"/>
-          <w:i/>
-          <w:iCs/>
-          <w:color w:val="595959"/>
-          <w:sz w:val="22"/>
-          <w:szCs w:val="22"/>
-        </w:rPr>
-        <w:t xml:space="preserve">Hình 4.8: Dữ liệu mẫu bảng SanPham</w:t>
+        <w:t>Hình 4.9: Dữ liệu mẫu bảng SanPham</w:t>
       </w:r>
     </w:p>
     <w:p>
@@ -5051,15 +5079,7 @@
         <w:jc w:val="center"/>
       </w:pPr>
       <w:r>
-        <w:rPr>
-          <w:rFonts w:ascii="Times New Roman" w:eastAsia="Times New Roman"/>
-          <w:i/>
-          <w:iCs/>
-          <w:color w:val="595959"/>
-          <w:sz w:val="22"/>
-          <w:szCs w:val="22"/>
-        </w:rPr>
-        <w:t xml:space="preserve">Hình 4.9: Dữ liệu mẫu bảng HoaDon</w:t>
+        <w:t>Hình 4.10: Dữ liệu mẫu bảng HoaDon</w:t>
       </w:r>
     </w:p>
     <w:p>
@@ -5152,15 +5172,7 @@
         <w:jc w:val="center"/>
       </w:pPr>
       <w:r>
-        <w:rPr>
-          <w:rFonts w:ascii="Times New Roman" w:eastAsia="Times New Roman"/>
-          <w:i/>
-          <w:iCs/>
-          <w:color w:val="595959"/>
-          <w:sz w:val="22"/>
-          <w:szCs w:val="22"/>
-        </w:rPr>
-        <w:t xml:space="preserve">Hình 4.10: Dữ liệu mẫu bảng ChiTietHoaDon</w:t>
+        <w:t>Hình 4.11: Dữ liệu mẫu bảng ChiTietHoaDon</w:t>
       </w:r>
     </w:p>
     <w:p>
@@ -5253,15 +5265,7 @@
         <w:jc w:val="center"/>
       </w:pPr>
       <w:r>
-        <w:rPr>
-          <w:rFonts w:ascii="Times New Roman" w:eastAsia="Times New Roman"/>
-          <w:i/>
-          <w:iCs/>
-          <w:color w:val="595959"/>
-          <w:sz w:val="22"/>
-          <w:szCs w:val="22"/>
-        </w:rPr>
-        <w:t xml:space="preserve">Hình 4.11: Dữ liệu mẫu bảng NguoiDung</w:t>
+        <w:t>Hình 4.12: Dữ liệu mẫu bảng NguoiDung</w:t>
       </w:r>
     </w:p>
     <w:p>
@@ -5392,15 +5396,7 @@
         <w:jc w:val="center"/>
       </w:pPr>
       <w:r>
-        <w:rPr>
-          <w:rFonts w:ascii="Times New Roman" w:eastAsia="Times New Roman"/>
-          <w:i/>
-          <w:iCs/>
-          <w:color w:val="595959"/>
-          <w:sz w:val="22"/>
-          <w:szCs w:val="22"/>
-        </w:rPr>
-        <w:t xml:space="preserve">Hình 4.12: Giao diện đăng nhập</w:t>
+        <w:t>Hình 4.13: Giao diện đăng nhập</w:t>
       </w:r>
     </w:p>
     <w:p>
@@ -5493,15 +5489,7 @@
         <w:jc w:val="center"/>
       </w:pPr>
       <w:r>
-        <w:rPr>
-          <w:rFonts w:ascii="Times New Roman" w:eastAsia="Times New Roman"/>
-          <w:i/>
-          <w:iCs/>
-          <w:color w:val="595959"/>
-          <w:sz w:val="22"/>
-          <w:szCs w:val="22"/>
-        </w:rPr>
-        <w:t xml:space="preserve">Hình 4.13: Giao diện Sơ đồ bàn</w:t>
+        <w:t>Hình 4.14: Giao diện Sơ đồ bàn</w:t>
       </w:r>
     </w:p>
     <w:p>
@@ -5594,15 +5582,7 @@
         <w:jc w:val="center"/>
       </w:pPr>
       <w:r>
-        <w:rPr>
-          <w:rFonts w:ascii="Times New Roman" w:eastAsia="Times New Roman"/>
-          <w:i/>
-          <w:iCs/>
-          <w:color w:val="595959"/>
-          <w:sz w:val="22"/>
-          <w:szCs w:val="22"/>
-        </w:rPr>
-        <w:t xml:space="preserve">Hình 4.14: Giao diện Gọi món</w:t>
+        <w:t>Hình 4.15: Giao diện Gọi món</w:t>
       </w:r>
     </w:p>
     <w:p>
@@ -5695,15 +5675,7 @@
         <w:jc w:val="center"/>
       </w:pPr>
       <w:r>
-        <w:rPr>
-          <w:rFonts w:ascii="Times New Roman" w:eastAsia="Times New Roman"/>
-          <w:i/>
-          <w:iCs/>
-          <w:color w:val="595959"/>
-          <w:sz w:val="22"/>
-          <w:szCs w:val="22"/>
-        </w:rPr>
-        <w:t xml:space="preserve">Hình 4.15: Giao diện Thực đơn</w:t>
+        <w:t>Hình 4.16: Giao diện Thực đơn</w:t>
       </w:r>
     </w:p>
     <w:p>
@@ -5796,15 +5768,7 @@
         <w:jc w:val="center"/>
       </w:pPr>
       <w:r>
-        <w:rPr>
-          <w:rFonts w:ascii="Times New Roman" w:eastAsia="Times New Roman"/>
-          <w:i/>
-          <w:iCs/>
-          <w:color w:val="595959"/>
-          <w:sz w:val="22"/>
-          <w:szCs w:val="22"/>
-        </w:rPr>
-        <w:t xml:space="preserve">Hình 4.16: Giao diện Lịch sử</w:t>
+        <w:t>Hình 4.17: Giao diện Lịch sử</w:t>
       </w:r>
     </w:p>
     <w:p>
@@ -5897,15 +5861,7 @@
         <w:jc w:val="center"/>
       </w:pPr>
       <w:r>
-        <w:rPr>
-          <w:rFonts w:ascii="Times New Roman" w:eastAsia="Times New Roman"/>
-          <w:i/>
-          <w:iCs/>
-          <w:color w:val="595959"/>
-          <w:sz w:val="22"/>
-          <w:szCs w:val="22"/>
-        </w:rPr>
-        <w:t xml:space="preserve">Hình 4.17: Giao diện Báo cáo</w:t>
+        <w:t>Hình 4.18: Giao diện Báo cáo</w:t>
       </w:r>
     </w:p>
     <w:p>

</xml_diff>